<commit_message>
Update Laporan Hasil Analisis with clean human-readable text (no underscores)
</commit_message>
<xml_diff>
--- a/Laporan Hasil Analisis - Dampak AI terhadap Mahasiswa.docx
+++ b/Laporan Hasil Analisis - Dampak AI terhadap Mahasiswa.docx
@@ -85,7 +85,7 @@
                 <w:color w:val="475569"/>
                 <w:sz w:val="20"/>
               </w:rPr>
-              <w:t>AI Impact on Students – Academic &amp; Well-being Dataset</w:t>
+              <w:t>Dampak AI pada Mahasiswa – Data Akademik &amp; Kesejahteraan</w:t>
             </w:r>
           </w:p>
         </w:tc>
@@ -371,7 +371,7 @@
           <w:color w:val="0F172A"/>
           <w:sz w:val="20"/>
         </w:rPr>
-        <w:t>Pengguna AI intensitas sedang (Moderate User, 5–15 jam/minggu) mencatat peningkatan IPK tertinggi (Δ = +0,227) dibandingkan Light User (+0,195) dan Heavy User (+0,173).</w:t>
+        <w:t>Pengguna AI intensitas sedang (Moderate User, 5–15 jam/minggu) mencatat peningkatan IPK tertinggi (selisih = +0,227) dibandingkan Pengguna Ringan (+0,195) dan Pengguna Berat (+0,173).</w:t>
       </w:r>
     </w:p>
     <w:p>
@@ -385,7 +385,7 @@
           <w:color w:val="0F172A"/>
           <w:sz w:val="20"/>
         </w:rPr>
-        <w:t>Mahasiswa Heavy User memiliki risiko burnout yang sangat tinggi (64,8%) dibandingkan Light User (10,5%) dan Moderate User (24,3%).</w:t>
+        <w:t>Mahasiswa Pengguna Berat memiliki risiko burnout yang sangat tinggi (64,8%) dibandingkan Pengguna Ringan (10,5%) dan Pengguna Sedang (24,3%).</w:t>
       </w:r>
     </w:p>
     <w:p>
@@ -399,7 +399,7 @@
           <w:color w:val="0F172A"/>
           <w:sz w:val="20"/>
         </w:rPr>
-        <w:t>Kebijakan institusi Strict Ban berkorelasi dengan persentase burnout tinggi sebesar 29,8% dan kecemasan ujian rata-rata 4,89/10, lebih buruk dibandingkan kebijakan permisif.</w:t>
+        <w:t>Kebijakan institusi berupa Larangan Ketat berkorelasi dengan persentase burnout tinggi sebesar 29,8% dan kecemasan ujian rata-rata 4,89/10, lebih buruk dibandingkan kebijakan yang mengizinkan atau mendorong.</w:t>
       </w:r>
     </w:p>
     <w:p>
@@ -413,7 +413,7 @@
           <w:color w:val="0F172A"/>
           <w:sz w:val="20"/>
         </w:rPr>
-        <w:t>IPK Awal merupakan prediktor terkuat IPK Akhir (r = 0,927), sedangkan jam penggunaan AI mingguan memiliki korelasi negatif lemah (r = -0,019), mengindikasikan bahwa kualitas belajar lebih menentukan daripada volume penggunaan AI.</w:t>
+        <w:t>IPK Awal merupakan prediktor terkuat IPK Akhir (r = 0,927), sedangkan jam penggunaan AI mingguan memiliki korelasi negatif lemah (r = -0,019), mengindikasikan bahwa kualitas belajar mandiri lebih menentukan daripada volume penggunaan AI.</w:t>
       </w:r>
     </w:p>
     <w:p/>
@@ -429,7 +429,7 @@
           <w:color w:val="475569"/>
           <w:sz w:val="20"/>
         </w:rPr>
-        <w:t>Berdasarkan temuan tersebut, konsultan pendidikan disarankan untuk mendorong kebijakan penggunaan AI yang terintegrasi dan terstruktur, menargetkan intervensi khusus bagi Heavy User dengan risiko burnout tinggi, serta memprioritaskan pengembangan kemampuan belajar mandiri (Traditional Study Hours) yang terbukti meningkatkan retensi pengetahuan dan performa akademik secara signifikan.</w:t>
+        <w:t>Berdasarkan temuan tersebut, konsultan pendidikan disarankan untuk mendorong kebijakan penggunaan AI yang terintegrasi dan terstruktur, menargetkan intervensi khusus bagi Pengguna Berat dengan risiko burnout tinggi, serta memprioritaskan pengembangan kemampuan belajar mandiri (Jam Belajar Mandiri) yang terbukti meningkatkan retensi pengetahuan dan performa akademik secara signifikan.</w:t>
       </w:r>
     </w:p>
     <w:p>
@@ -486,7 +486,7 @@
           <w:i w:val="0"/>
           <w:sz w:val="22"/>
         </w:rPr>
-        <w:t>Ketiadaan bukti empiris yang memadai menyulitkan pemangku kepentingan dalam menjawab pertanyaan fundamental: apakah AI generatif merupakan katalisator peningkatan kualitas akademik, ataukah justru menjadi faktor risiko bagi kesehatan mental dan retensi pengetahuan jangka panjang? Dataset "AI Impact on Students" yang dikumpulkan dari survei dan sistem informasi akademik selama satu semester penuh memberikan kesempatan unik untuk menjawab pertanyaan tersebut secara kuantitatif dan berbasis data.</w:t>
+        <w:t>Ketiadaan bukti empiris yang memadai menyulitkan pemangku kepentingan dalam menjawab pertanyaan fundamental: apakah AI generatif merupakan katalisator peningkatan kualitas akademik, ataukah justru menjadi faktor risiko bagi kesehatan mental dan retensi pengetahuan jangka panjang? Dataset Dampak AI pada Mahasiswa yang dikumpulkan dari survei dan sistem informasi akademik selama satu semester penuh memberikan kesempatan unik untuk menjawab pertanyaan tersebut secara kuantitatif dan berbasis data.</w:t>
       </w:r>
     </w:p>
     <w:p>
@@ -868,7 +868,7 @@
                 <w:color w:val="0F172A"/>
                 <w:sz w:val="18"/>
               </w:rPr>
-              <w:t>Bagaimana perbedaan kebijakan institusi (ban/allowed/encouraged) memengaruhi performa dan kesehatan mental?</w:t>
+              <w:t>Bagaimana perbedaan kebijakan institusi (dilarang/diizinkan/didorong) memengaruhi performa dan kesehatan mental?</w:t>
             </w:r>
           </w:p>
         </w:tc>
@@ -1418,7 +1418,7 @@
           <w:i w:val="0"/>
           <w:sz w:val="22"/>
         </w:rPr>
-        <w:t>Data primer bersumber dari file ai_student_impact_dataset.csv yang berisi 50.000 catatan mahasiswa dari berbagai perguruan tinggi internasional. Data dikumpulkan melalui survei self-report dan sistem informasi akademik selama satu semester penuh. Dataset mencakup 16 variabel yang meliputi profil akademik (IPK Awal dan Akhir), perilaku penggunaan AI (jam mingguan, keberagaman tools, kemampuan prompt), kebiasaan belajar mandiri, kebijakan institusi, dan indikator kesehatan mental.</w:t>
+        <w:t>Data primer bersumber dari data mentah dampak AI mahasiswa yang berisi 50.000 catatan mahasiswa dari berbagai perguruan tinggi internasional. Data dikumpulkan melalui survei mandiri dan sistem informasi akademik selama satu semester penuh. Dataset mencakup 16 variabel yang meliputi profil akademik (IPK Awal dan Akhir), perilaku penggunaan AI (jam mingguan, keberagaman alat, kemampuan prompt), kebiasaan belajar mandiri, kebijakan institusi, dan indikator kesehatan mental.</w:t>
       </w:r>
     </w:p>
     <w:p>
@@ -1627,7 +1627,7 @@
                 <w:color w:val="0F172A"/>
                 <w:sz w:val="18"/>
               </w:rPr>
-              <w:t>2 baris (Student_ID: 100465, 145825)</w:t>
+              <w:t>2 baris (ID Mahasiswa: 100465, 145825)</w:t>
             </w:r>
           </w:p>
         </w:tc>
@@ -1705,7 +1705,7 @@
                 <w:color w:val="0F172A"/>
                 <w:sz w:val="18"/>
               </w:rPr>
-              <w:t>Primary_Use_Case kosong</w:t>
+              <w:t>Tujuan Utama Penggunaan AI kosong</w:t>
             </w:r>
           </w:p>
         </w:tc>
@@ -1724,7 +1724,7 @@
                 <w:color w:val="0F172A"/>
                 <w:sz w:val="18"/>
               </w:rPr>
-              <w:t>1 baris (Student_ID: 100465)</w:t>
+              <w:t>1 baris (ID Mahasiswa: 100465)</w:t>
             </w:r>
           </w:p>
         </w:tc>
@@ -1743,7 +1743,7 @@
                 <w:color w:val="0F172A"/>
                 <w:sz w:val="18"/>
               </w:rPr>
-              <w:t>Imputasi dengan nilai modus (Debugging/Troubleshooting)</w:t>
+              <w:t>Imputasi dengan nilai modus (Pencarian Kesalahan/Debugging)</w:t>
             </w:r>
           </w:p>
         </w:tc>
@@ -1802,7 +1802,7 @@
                 <w:color w:val="0F172A"/>
                 <w:sz w:val="18"/>
               </w:rPr>
-              <w:t>Post_Semester_GPA kosong</w:t>
+              <w:t>IPK Akhir kosong</w:t>
             </w:r>
           </w:p>
         </w:tc>
@@ -1821,7 +1821,7 @@
                 <w:color w:val="0F172A"/>
                 <w:sz w:val="18"/>
               </w:rPr>
-              <w:t>1 baris (Student_ID: 145825)</w:t>
+              <w:t>1 baris (ID Mahasiswa: 145825)</w:t>
             </w:r>
           </w:p>
         </w:tc>
@@ -1899,7 +1899,7 @@
                 <w:color w:val="0F172A"/>
                 <w:sz w:val="18"/>
               </w:rPr>
-              <w:t>Pre_Semester_GPA &gt; 4.00</w:t>
+              <w:t>IPK Awal &gt; 4.00</w:t>
             </w:r>
           </w:p>
         </w:tc>
@@ -1918,7 +1918,7 @@
                 <w:color w:val="0F172A"/>
                 <w:sz w:val="18"/>
               </w:rPr>
-              <w:t>1 baris (Student_ID: 145219)</w:t>
+              <w:t>1 baris (ID Mahasiswa: 145219)</w:t>
             </w:r>
           </w:p>
         </w:tc>
@@ -1996,7 +1996,7 @@
                 <w:color w:val="0F172A"/>
                 <w:sz w:val="18"/>
               </w:rPr>
-              <w:t>Post_Semester_GPA &gt; 4.00</w:t>
+              <w:t>IPK Akhir &gt; 4.00</w:t>
             </w:r>
           </w:p>
         </w:tc>
@@ -2015,7 +2015,7 @@
                 <w:color w:val="0F172A"/>
                 <w:sz w:val="18"/>
               </w:rPr>
-              <w:t>1 baris (Student_ID: 100089)</w:t>
+              <w:t>1 baris (ID Mahasiswa: 100089)</w:t>
             </w:r>
           </w:p>
         </w:tc>
@@ -2093,7 +2093,7 @@
                 <w:color w:val="0F172A"/>
                 <w:sz w:val="18"/>
               </w:rPr>
-              <w:t>Tool_Diversity &gt; 5</w:t>
+              <w:t>Keberagaman Alat AI &gt; 5</w:t>
             </w:r>
           </w:p>
         </w:tc>
@@ -2112,7 +2112,7 @@
                 <w:color w:val="0F172A"/>
                 <w:sz w:val="18"/>
               </w:rPr>
-              <w:t>1 baris (Student_ID: 100297)</w:t>
+              <w:t>1 baris (ID Mahasiswa: 100297)</w:t>
             </w:r>
           </w:p>
         </w:tc>
@@ -2190,7 +2190,7 @@
                 <w:color w:val="0F172A"/>
                 <w:sz w:val="18"/>
               </w:rPr>
-              <w:t>Year_of_Study = "123"</w:t>
+              <w:t>Tahun Studi = "123"</w:t>
             </w:r>
           </w:p>
         </w:tc>
@@ -2209,7 +2209,7 @@
                 <w:color w:val="0F172A"/>
                 <w:sz w:val="18"/>
               </w:rPr>
-              <w:t>1 baris (Student_ID: 127687)</w:t>
+              <w:t>1 baris (ID Mahasiswa: 127687)</w:t>
             </w:r>
           </w:p>
         </w:tc>
@@ -2287,7 +2287,7 @@
                 <w:color w:val="0F172A"/>
                 <w:sz w:val="18"/>
               </w:rPr>
-              <w:t>Student_ID (mixed), Paid_Subscription (string)</w:t>
+              <w:t>ID Mahasiswa (tipe campuran), Langganan Berbayar (teks)</w:t>
             </w:r>
           </w:p>
         </w:tc>
@@ -2325,7 +2325,7 @@
                 <w:color w:val="0F172A"/>
                 <w:sz w:val="18"/>
               </w:rPr>
-              <w:t>Konversi ke Int64 dan Boolean</w:t>
+              <w:t>Konversi ke Integer 64-bit dan Boolean</w:t>
             </w:r>
           </w:p>
         </w:tc>
@@ -2344,7 +2344,7 @@
           <w:color w:val="475569"/>
           <w:sz w:val="20"/>
         </w:rPr>
-        <w:t>Setelah pembersihan, dataset akhir berisi 49.995 baris dan 17 kolom (termasuk kolom AI_Usage_Segment yang ditambahkan hasil segmentasi) serta fitur turunan Delta_IPK = IPK Akhir – IPK Awal.</w:t>
+        <w:t>Setelah pembersihan, dataset akhir berisi 49.995 baris dan 17 kolom (termasuk kolom Segmen Penggunaan AI yang ditambahkan hasil segmentasi) serta fitur turunan Perubahan IPK (Delta IPK) = IPK Akhir – IPK Awal.</w:t>
       </w:r>
     </w:p>
     <w:p>
@@ -2376,27 +2376,6 @@
       <w:tr>
         <w:tc>
           <w:tcPr>
-            <w:tcW w:type="dxa" w:w="1728"/>
-            <w:shd w:val="clear" w:color="auto" w:fill="4F46E5"/>
-            <w:vAlign w:val="center"/>
-          </w:tcPr>
-          <w:p>
-            <w:pPr>
-              <w:jc w:val="center"/>
-            </w:pPr>
-            <w:r>
-              <w:rPr>
-                <w:rFonts w:ascii="Calibri" w:hAnsi="Calibri"/>
-                <w:b/>
-                <w:color w:val="FFFFFF"/>
-                <w:sz w:val="18"/>
-              </w:rPr>
-              <w:t>Segmen</w:t>
-            </w:r>
-          </w:p>
-        </w:tc>
-        <w:tc>
-          <w:tcPr>
             <w:tcW w:type="dxa" w:w="2160"/>
             <w:shd w:val="clear" w:color="auto" w:fill="4F46E5"/>
             <w:vAlign w:val="center"/>
@@ -2412,6 +2391,27 @@
                 <w:color w:val="FFFFFF"/>
                 <w:sz w:val="18"/>
               </w:rPr>
+              <w:t>Segmen</w:t>
+            </w:r>
+          </w:p>
+        </w:tc>
+        <w:tc>
+          <w:tcPr>
+            <w:tcW w:type="dxa" w:w="2160"/>
+            <w:shd w:val="clear" w:color="auto" w:fill="4F46E5"/>
+            <w:vAlign w:val="center"/>
+          </w:tcPr>
+          <w:p>
+            <w:pPr>
+              <w:jc w:val="center"/>
+            </w:pPr>
+            <w:r>
+              <w:rPr>
+                <w:rFonts w:ascii="Calibri" w:hAnsi="Calibri"/>
+                <w:b/>
+                <w:color w:val="FFFFFF"/>
+                <w:sz w:val="18"/>
+              </w:rPr>
               <w:t>Rentang Penggunaan</w:t>
             </w:r>
           </w:p>
@@ -2460,7 +2460,7 @@
         </w:tc>
         <w:tc>
           <w:tcPr>
-            <w:tcW w:type="dxa" w:w="3600"/>
+            <w:tcW w:type="dxa" w:w="3168"/>
             <w:shd w:val="clear" w:color="auto" w:fill="4F46E5"/>
             <w:vAlign w:val="center"/>
           </w:tcPr>
@@ -2483,30 +2483,30 @@
       <w:tr>
         <w:tc>
           <w:tcPr>
-            <w:tcW w:type="dxa" w:w="1728"/>
-            <w:shd w:val="clear" w:color="auto" w:fill="F8FAFC"/>
-          </w:tcPr>
-          <w:p>
-            <w:pPr>
-              <w:jc w:val="left"/>
-            </w:pPr>
-            <w:r>
-              <w:rPr>
-                <w:rFonts w:ascii="Calibri" w:hAnsi="Calibri"/>
-                <w:color w:val="0F172A"/>
-                <w:sz w:val="18"/>
-              </w:rPr>
-              <w:t>Light User</w:t>
-            </w:r>
-          </w:p>
-        </w:tc>
-        <w:tc>
-          <w:tcPr>
             <w:tcW w:type="dxa" w:w="2160"/>
             <w:shd w:val="clear" w:color="auto" w:fill="F8FAFC"/>
           </w:tcPr>
           <w:p>
             <w:pPr>
+              <w:jc w:val="left"/>
+            </w:pPr>
+            <w:r>
+              <w:rPr>
+                <w:rFonts w:ascii="Calibri" w:hAnsi="Calibri"/>
+                <w:color w:val="0F172A"/>
+                <w:sz w:val="18"/>
+              </w:rPr>
+              <w:t>Pengguna Ringan (Light User)</w:t>
+            </w:r>
+          </w:p>
+        </w:tc>
+        <w:tc>
+          <w:tcPr>
+            <w:tcW w:type="dxa" w:w="2160"/>
+            <w:shd w:val="clear" w:color="auto" w:fill="F8FAFC"/>
+          </w:tcPr>
+          <w:p>
+            <w:pPr>
               <w:jc w:val="center"/>
             </w:pPr>
             <w:r>
@@ -2559,7 +2559,7 @@
         </w:tc>
         <w:tc>
           <w:tcPr>
-            <w:tcW w:type="dxa" w:w="3600"/>
+            <w:tcW w:type="dxa" w:w="3168"/>
             <w:shd w:val="clear" w:color="auto" w:fill="F8FAFC"/>
           </w:tcPr>
           <w:p>
@@ -2580,30 +2580,30 @@
       <w:tr>
         <w:tc>
           <w:tcPr>
-            <w:tcW w:type="dxa" w:w="1728"/>
-            <w:shd w:val="clear" w:color="auto" w:fill="FFFFFF"/>
-          </w:tcPr>
-          <w:p>
-            <w:pPr>
-              <w:jc w:val="left"/>
-            </w:pPr>
-            <w:r>
-              <w:rPr>
-                <w:rFonts w:ascii="Calibri" w:hAnsi="Calibri"/>
-                <w:color w:val="0F172A"/>
-                <w:sz w:val="18"/>
-              </w:rPr>
-              <w:t>Moderate User</w:t>
-            </w:r>
-          </w:p>
-        </w:tc>
-        <w:tc>
-          <w:tcPr>
             <w:tcW w:type="dxa" w:w="2160"/>
             <w:shd w:val="clear" w:color="auto" w:fill="FFFFFF"/>
           </w:tcPr>
           <w:p>
             <w:pPr>
+              <w:jc w:val="left"/>
+            </w:pPr>
+            <w:r>
+              <w:rPr>
+                <w:rFonts w:ascii="Calibri" w:hAnsi="Calibri"/>
+                <w:color w:val="0F172A"/>
+                <w:sz w:val="18"/>
+              </w:rPr>
+              <w:t>Pengguna Sedang (Moderate User)</w:t>
+            </w:r>
+          </w:p>
+        </w:tc>
+        <w:tc>
+          <w:tcPr>
+            <w:tcW w:type="dxa" w:w="2160"/>
+            <w:shd w:val="clear" w:color="auto" w:fill="FFFFFF"/>
+          </w:tcPr>
+          <w:p>
+            <w:pPr>
               <w:jc w:val="center"/>
             </w:pPr>
             <w:r>
@@ -2656,7 +2656,7 @@
         </w:tc>
         <w:tc>
           <w:tcPr>
-            <w:tcW w:type="dxa" w:w="3600"/>
+            <w:tcW w:type="dxa" w:w="3168"/>
             <w:shd w:val="clear" w:color="auto" w:fill="FFFFFF"/>
           </w:tcPr>
           <w:p>
@@ -2677,30 +2677,30 @@
       <w:tr>
         <w:tc>
           <w:tcPr>
-            <w:tcW w:type="dxa" w:w="1728"/>
-            <w:shd w:val="clear" w:color="auto" w:fill="F8FAFC"/>
-          </w:tcPr>
-          <w:p>
-            <w:pPr>
-              <w:jc w:val="left"/>
-            </w:pPr>
-            <w:r>
-              <w:rPr>
-                <w:rFonts w:ascii="Calibri" w:hAnsi="Calibri"/>
-                <w:color w:val="0F172A"/>
-                <w:sz w:val="18"/>
-              </w:rPr>
-              <w:t>Heavy User</w:t>
-            </w:r>
-          </w:p>
-        </w:tc>
-        <w:tc>
-          <w:tcPr>
             <w:tcW w:type="dxa" w:w="2160"/>
             <w:shd w:val="clear" w:color="auto" w:fill="F8FAFC"/>
           </w:tcPr>
           <w:p>
             <w:pPr>
+              <w:jc w:val="left"/>
+            </w:pPr>
+            <w:r>
+              <w:rPr>
+                <w:rFonts w:ascii="Calibri" w:hAnsi="Calibri"/>
+                <w:color w:val="0F172A"/>
+                <w:sz w:val="18"/>
+              </w:rPr>
+              <w:t>Pengguna Berat (Heavy User)</w:t>
+            </w:r>
+          </w:p>
+        </w:tc>
+        <w:tc>
+          <w:tcPr>
+            <w:tcW w:type="dxa" w:w="2160"/>
+            <w:shd w:val="clear" w:color="auto" w:fill="F8FAFC"/>
+          </w:tcPr>
+          <w:p>
+            <w:pPr>
               <w:jc w:val="center"/>
             </w:pPr>
             <w:r>
@@ -2753,7 +2753,7 @@
         </w:tc>
         <w:tc>
           <w:tcPr>
-            <w:tcW w:type="dxa" w:w="3600"/>
+            <w:tcW w:type="dxa" w:w="3168"/>
             <w:shd w:val="clear" w:color="auto" w:fill="F8FAFC"/>
           </w:tcPr>
           <w:p>
@@ -2875,7 +2875,7 @@
                 <w:color w:val="0F172A"/>
                 <w:sz w:val="18"/>
               </w:rPr>
-              <w:t>Mean, Median, Std, Min-Max, Q1-Q3 seluruh variabel numerik</w:t>
+              <w:t>Rata-rata, median, standar deviasi, nilai minimum, maksimum, kuartil 1, dan kuartil 3 seluruh variabel numerik</w:t>
             </w:r>
           </w:p>
         </w:tc>
@@ -2955,7 +2955,7 @@
                 <w:color w:val="0F172A"/>
                 <w:sz w:val="18"/>
               </w:rPr>
-              <w:t>Perbandingan IPK dan retensi antara pengguna berbayar vs gratis (α = 5%)</w:t>
+              <w:t>Perbandingan IPK dan retensi antara pengguna akun berbayar vs gratis (tingkat signifikansi 5%)</w:t>
             </w:r>
           </w:p>
         </w:tc>
@@ -2995,7 +2995,7 @@
                 <w:color w:val="0F172A"/>
                 <w:sz w:val="18"/>
               </w:rPr>
-              <w:t>Perbandingan rata-rata KPI antar kelompok (segmen, jenjang, bidang studi, kebijakan)</w:t>
+              <w:t>Perbandingan rata-rata indikator kinerja utama antar kelompok (segmen, jenjang, bidang studi, kebijakan)</w:t>
             </w:r>
           </w:p>
         </w:tc>
@@ -3056,7 +3056,7 @@
                 <w:color w:val="0F172A"/>
                 <w:sz w:val="18"/>
               </w:rPr>
-              <w:t>Visualisasi EDA</w:t>
+              <w:t>Visualisasi Data</w:t>
             </w:r>
           </w:p>
         </w:tc>
@@ -3075,7 +3075,7 @@
                 <w:color w:val="0F172A"/>
                 <w:sz w:val="18"/>
               </w:rPr>
-              <w:t>&gt; 20 visualisasi interaktif melalui dashboard Streamlit (histogram, bar, scatter, heatmap, pie)</w:t>
+              <w:t>Pembuatan lebih dari 20 visualisasi interaktif melalui dashboard (histogram, bar, scatter, heatmap, pie)</w:t>
             </w:r>
           </w:p>
         </w:tc>
@@ -3121,7 +3121,7 @@
           <w:i w:val="0"/>
           <w:sz w:val="22"/>
         </w:rPr>
-        <w:t>Secara keseluruhan, IPK rata-rata mahasiswa meningkat dari 3,146 (IPK Awal) menjadi 3,349 (IPK Akhir), dengan selisih rata-rata (Delta IPK = +0,203, Std = 0,187). Sebanyak 87,5% mahasiswa mengalami peningkatan IPK, sementara 12,4% mengalami penurunan.</w:t>
+        <w:t>Secara keseluruhan, IPK rata-rata mahasiswa meningkat dari 3,146 (IPK Awal) menjadi 3,349 (IPK Akhir), dengan selisih rata-rata (Perubahan IPK = +0,203, Std = 0,187). Sebanyak 87,5% mahasiswa mengalami peningkatan IPK, sementara 12,4% mengalami penurunan.</w:t>
       </w:r>
     </w:p>
     <w:tbl>
@@ -3142,7 +3142,7 @@
       <w:tr>
         <w:tc>
           <w:tcPr>
-            <w:tcW w:type="dxa" w:w="1872"/>
+            <w:tcW w:type="dxa" w:w="2160"/>
             <w:shd w:val="clear" w:color="auto" w:fill="4F46E5"/>
             <w:vAlign w:val="center"/>
           </w:tcPr>
@@ -3241,7 +3241,7 @@
                 <w:color w:val="FFFFFF"/>
                 <w:sz w:val="18"/>
               </w:rPr>
-              <w:t>Delta IPK</w:t>
+              <w:t>Perubahan IPK</w:t>
             </w:r>
           </w:p>
         </w:tc>
@@ -3270,7 +3270,7 @@
       <w:tr>
         <w:tc>
           <w:tcPr>
-            <w:tcW w:type="dxa" w:w="1872"/>
+            <w:tcW w:type="dxa" w:w="2160"/>
             <w:shd w:val="clear" w:color="auto" w:fill="F8FAFC"/>
           </w:tcPr>
           <w:p>
@@ -3283,7 +3283,7 @@
                 <w:color w:val="0F172A"/>
                 <w:sz w:val="18"/>
               </w:rPr>
-              <w:t>Light User</w:t>
+              <w:t>Pengguna Ringan</w:t>
             </w:r>
           </w:p>
         </w:tc>
@@ -3386,7 +3386,7 @@
       <w:tr>
         <w:tc>
           <w:tcPr>
-            <w:tcW w:type="dxa" w:w="1872"/>
+            <w:tcW w:type="dxa" w:w="2160"/>
             <w:shd w:val="clear" w:color="auto" w:fill="FFFFFF"/>
           </w:tcPr>
           <w:p>
@@ -3399,7 +3399,7 @@
                 <w:color w:val="0F172A"/>
                 <w:sz w:val="18"/>
               </w:rPr>
-              <w:t>Moderate User</w:t>
+              <w:t>Pengguna Sedang</w:t>
             </w:r>
           </w:p>
         </w:tc>
@@ -3502,7 +3502,7 @@
       <w:tr>
         <w:tc>
           <w:tcPr>
-            <w:tcW w:type="dxa" w:w="1872"/>
+            <w:tcW w:type="dxa" w:w="2160"/>
             <w:shd w:val="clear" w:color="auto" w:fill="F8FAFC"/>
           </w:tcPr>
           <w:p>
@@ -3515,7 +3515,7 @@
                 <w:color w:val="0F172A"/>
                 <w:sz w:val="18"/>
               </w:rPr>
-              <w:t>Heavy User</w:t>
+              <w:t>Pengguna Berat</w:t>
             </w:r>
           </w:p>
         </w:tc>
@@ -3618,7 +3618,7 @@
       <w:tr>
         <w:tc>
           <w:tcPr>
-            <w:tcW w:type="dxa" w:w="1872"/>
+            <w:tcW w:type="dxa" w:w="2160"/>
             <w:shd w:val="clear" w:color="auto" w:fill="FFFFFF"/>
           </w:tcPr>
           <w:p>
@@ -3745,7 +3745,7 @@
           <w:color w:val="475569"/>
           <w:sz w:val="20"/>
         </w:rPr>
-        <w:t>Interpretasi: Moderate User memiliki Delta IPK tertinggi (+0,227) sekaligus retensi pengetahuan tertinggi (76,99%). Heavy User justru mencatat Delta IPK terendah (+0,173) dan retensi paling rendah (72,69%). Hal ini mengindikasikan bahwa ada ambang batas optimal penggunaan AI: penggunaan sedang (5–15 jam/minggu) memaksimalkan manfaat AI tanpa mengorbankan penguatan kognitif mandiri.</w:t>
+        <w:t>Interpretasi: Pengguna Sedang memiliki Perubahan IPK tertinggi (+0,227) sekaligus retensi pengetahuan tertinggi (76,99%). Pengguna Berat justru mencatat Perubahan IPK terendah (+0,173) dan retensi paling rendah (72,69%). Hal ini mengindikasikan bahwa ada ambang batas optimal penggunaan AI: penggunaan sedang (5–15 jam/minggu) memaksimalkan manfaat AI tanpa mengorbankan penguatan kognitif mandiri.</w:t>
       </w:r>
     </w:p>
     <w:p>
@@ -3771,7 +3771,7 @@
           <w:i w:val="0"/>
           <w:sz w:val="22"/>
         </w:rPr>
-        <w:t>Analisis korelasi Pearson mengungkapkan bahwa IPK Awal memiliki korelasi tertinggi terhadap IPK Akhir (r = 0,9268), jauh melampaui variabel perilaku belajar lainnya. Sebaliknya, jam penggunaan AI mingguan justru berkorelasi negatif (r = -0,019) dengan IPK Akhir, meskipun lemah.</w:t>
+        <w:t>Analisis korelasi Pearson mengungkapkan bahwa IPK Awal memiliki korelasi tertinggi terhadap IPK Akhir (r = 0,9268), jauh melampaui variabel perilaku belajar lainnya. Sebaliknya, jam penggunaan AI mingguan justru berkorelasi negatif (r = -0,019) dengan IPK Akhir, meskipun sangat lemah.</w:t>
       </w:r>
     </w:p>
     <w:tbl>
@@ -3889,7 +3889,7 @@
                 <w:color w:val="0F172A"/>
                 <w:sz w:val="18"/>
               </w:rPr>
-              <w:t>IPK Awal (Pre_Semester_GPA)</w:t>
+              <w:t>IPK Awal</w:t>
             </w:r>
           </w:p>
         </w:tc>
@@ -3967,7 +3967,7 @@
                 <w:color w:val="0F172A"/>
                 <w:sz w:val="18"/>
               </w:rPr>
-              <w:t>Perbedaan IPK (Delta_IPK)</w:t>
+              <w:t>Perubahan IPK (Delta IPK)</w:t>
             </w:r>
           </w:p>
         </w:tc>
@@ -4045,7 +4045,7 @@
                 <w:color w:val="0F172A"/>
                 <w:sz w:val="18"/>
               </w:rPr>
-              <w:t>Skor Retensi (Skill_Retention_Score)</w:t>
+              <w:t>Skor Retensi Pengetahuan</w:t>
             </w:r>
           </w:p>
         </w:tc>
@@ -4123,7 +4123,7 @@
                 <w:color w:val="0F172A"/>
                 <w:sz w:val="18"/>
               </w:rPr>
-              <w:t>Jam Belajar Mandiri (Traditional_Study_Hours)</w:t>
+              <w:t>Jam Belajar Mandiri</w:t>
             </w:r>
           </w:p>
         </w:tc>
@@ -4201,7 +4201,7 @@
                 <w:color w:val="0F172A"/>
                 <w:sz w:val="18"/>
               </w:rPr>
-              <w:t>Keberagaman Tools AI (Tool_Diversity)</w:t>
+              <w:t>Keberagaman Alat AI</w:t>
             </w:r>
           </w:p>
         </w:tc>
@@ -4279,7 +4279,7 @@
                 <w:color w:val="0F172A"/>
                 <w:sz w:val="18"/>
               </w:rPr>
-              <w:t>Ketergantungan AI (Perceived_AI_Dependency)</w:t>
+              <w:t>Persepsi Ketergantungan AI</w:t>
             </w:r>
           </w:p>
         </w:tc>
@@ -4357,7 +4357,7 @@
                 <w:color w:val="0F172A"/>
                 <w:sz w:val="18"/>
               </w:rPr>
-              <w:t>Kecemasan Ujian (Anxiety_Level)</w:t>
+              <w:t>Tingkat Kecemasan Ujian</w:t>
             </w:r>
           </w:p>
         </w:tc>
@@ -4435,7 +4435,7 @@
                 <w:color w:val="0F172A"/>
                 <w:sz w:val="18"/>
               </w:rPr>
-              <w:t>Jam AI Mingguan (Weekly_GenAI_Hours)</w:t>
+              <w:t>Jam Penggunaan AI Mingguan</w:t>
             </w:r>
           </w:p>
         </w:tc>
@@ -4511,7 +4511,7 @@
           <w:color w:val="475569"/>
           <w:sz w:val="20"/>
         </w:rPr>
-        <w:t>Interpretasi: Kualitas akademik bawaan mahasiswa (IPK Awal) mendominasi performa akhir. Waktu belajar mandiri (Traditional Study Hours) memiliki pengaruh positif yang lebih besar dibandingkan jam penggunaan AI. Penggunaan AI yang berlebihan tanpa diimbangi belajar mandiri justru berkorelasi negatif terhadap IPK.</w:t>
+        <w:t>Interpretasi: Kualitas akademik bawaan mahasiswa (IPK Awal) mendominasi performa akhir. Waktu belajar mandiri memiliki pengaruh positif yang lebih besar dibandingkan jam penggunaan AI. Penggunaan AI yang berlebihan tanpa diimbangi belajar mandiri justru berkorelasi negatif terhadap IPK.</w:t>
       </w:r>
     </w:p>
     <w:p>
@@ -4523,7 +4523,7 @@
           <w:rFonts w:ascii="Calibri" w:hAnsi="Calibri"/>
           <w:color w:val="0F172A"/>
         </w:rPr>
-        <w:t>Temuan 3: Heavy User Menghadapi Risiko Burnout Enam Kali Lebih Tinggi dari Light User</w:t>
+        <w:t>Temuan 3: Pengguna Berat Menghadapi Risiko Burnout Enam Kali Lebih Tinggi dari Pengguna Ringan</w:t>
       </w:r>
     </w:p>
     <w:p>
@@ -4537,7 +4537,7 @@
           <w:i w:val="0"/>
           <w:sz w:val="22"/>
         </w:rPr>
-        <w:t>Terdapat gradasi risiko burnout yang sangat tajam berdasarkan intensitas penggunaan AI. Mahasiswa Heavy User memiliki persentase burnout kategori Tinggi sebesar 64,8%, dibandingkan hanya 10,5% pada Light User. Pola serupa juga terlihat pada tingkat kecemasan ujian.</w:t>
+        <w:t>Terdapat gradasi risiko burnout yang sangat tajam berdasarkan intensitas penggunaan AI. Mahasiswa Pengguna Berat memiliki persentase burnout kategori Tinggi sebesar 64,8%, dibandingkan hanya 10,5% pada Pengguna Ringan. Pola serupa juga terlihat pada tingkat kecemasan ujian.</w:t>
       </w:r>
     </w:p>
     <w:tbl>
@@ -4699,7 +4699,7 @@
                 <w:color w:val="0F172A"/>
                 <w:sz w:val="18"/>
               </w:rPr>
-              <w:t>Light User</w:t>
+              <w:t>Pengguna Ringan</w:t>
             </w:r>
           </w:p>
         </w:tc>
@@ -4815,7 +4815,7 @@
                 <w:color w:val="0F172A"/>
                 <w:sz w:val="18"/>
               </w:rPr>
-              <w:t>Moderate User</w:t>
+              <w:t>Pengguna Sedang</w:t>
             </w:r>
           </w:p>
         </w:tc>
@@ -4931,7 +4931,7 @@
                 <w:color w:val="0F172A"/>
                 <w:sz w:val="18"/>
               </w:rPr>
-              <w:t>Heavy User</w:t>
+              <w:t>Pengguna Berat</w:t>
             </w:r>
           </w:p>
         </w:tc>
@@ -5045,7 +5045,7 @@
           <w:color w:val="475569"/>
           <w:sz w:val="20"/>
         </w:rPr>
-        <w:t>Interpretasi: Mahasiswa Heavy User tidak hanya mengalami risiko burnout yang dramatis tinggi (6× lipat dibandingkan Light User), tetapi juga memiliki skor ketergantungan AI rata-rata 5,73/10, mengindikasikan bahwa penggunaan intensif diikuti oleh ketergantungan psikologis yang mengkhawatirkan. Segmen ini merupakan prioritas utama intervensi konsultan.</w:t>
+        <w:t>Interpretasi: Mahasiswa Pengguna Berat tidak hanya mengalami risiko burnout yang dramatis tinggi (6× lipat dibandingkan Pengguna Ringan), tetapi juga memiliki skor ketergantungan AI rata-rata 5,73/10, mengindikasikan bahwa penggunaan intensif diikuti oleh ketergantungan psikologis yang mengkhawatirkan. Segmen ini merupakan prioritas utama intervensi.</w:t>
       </w:r>
     </w:p>
     <w:p>
@@ -5057,7 +5057,7 @@
           <w:rFonts w:ascii="Calibri" w:hAnsi="Calibri"/>
           <w:color w:val="0F172A"/>
         </w:rPr>
-        <w:t>Temuan 4: Kebijakan Strict Ban Berkorelasi dengan Dampak Kesehatan Mental yang Lebih Buruk</w:t>
+        <w:t>Temuan 4: Kebijakan Larangan Ketat Berkorelasi dengan Dampak Kesehatan Mental yang Lebih Buruk</w:t>
       </w:r>
     </w:p>
     <w:p>
@@ -5071,7 +5071,7 @@
           <w:i w:val="0"/>
           <w:sz w:val="22"/>
         </w:rPr>
-        <w:t>Analisis komparatif lintas kebijakan institusi menunjukkan bahwa kebijakan Strict Ban (pelarangan ketat AI) tidak menghasilkan performa akademik yang lebih baik, justru berkorelasi dengan persentase burnout dan kecemasan yang lebih tinggi.</w:t>
+        <w:t>Analisis komparatif lintas kebijakan institusi menunjukkan bahwa kebijakan Larangan Ketat (Strict Ban) tidak menghasilkan performa akademik yang lebih baik, justru berkorelasi dengan persentase burnout dan kecemasan yang lebih tinggi.</w:t>
       </w:r>
     </w:p>
     <w:tbl>
@@ -5233,7 +5233,7 @@
                 <w:color w:val="0F172A"/>
                 <w:sz w:val="18"/>
               </w:rPr>
-              <w:t>Actively_Encouraged</w:t>
+              <w:t>Sangat Didorong</w:t>
             </w:r>
           </w:p>
         </w:tc>
@@ -5349,7 +5349,7 @@
                 <w:color w:val="0F172A"/>
                 <w:sz w:val="18"/>
               </w:rPr>
-              <w:t>Allowed_With_Citation</w:t>
+              <w:t>Diizinkan dengan Sitasi</w:t>
             </w:r>
           </w:p>
         </w:tc>
@@ -5465,7 +5465,7 @@
                 <w:color w:val="0F172A"/>
                 <w:sz w:val="18"/>
               </w:rPr>
-              <w:t>Strict_Ban</w:t>
+              <w:t>Larangan Ketat</w:t>
             </w:r>
           </w:p>
         </w:tc>
@@ -5579,7 +5579,7 @@
           <w:color w:val="475569"/>
           <w:sz w:val="20"/>
         </w:rPr>
-        <w:t>Interpretasi: Kebijakan Strict Ban menghasilkan IPK rata-rata lebih rendah (3,333 vs 3,353), persentase burnout tinggi lebih besar (29,8% vs 23,8%), dan kecemasan ujian rata-rata tertinggi (4,89). Temuan ini menunjukkan bahwa pelarangan total AI tanpa alternatif dukungan belajar justru menciptakan tekanan akademik tambahan tanpa manfaat performa yang sepadan.</w:t>
+        <w:t>Interpretasi: Kebijakan Larangan Ketat menghasilkan IPK rata-rata lebih rendah (3,333 vs 3,353), persentase burnout tinggi lebih besar (29,8% vs 23,8%), and kecemasan ujian rata-rata tertinggi (4,89). Temuan ini menunjukkan bahwa pelarangan total AI tanpa alternatif dukungan belajar justru menciptakan tekanan akademik tambahan tanpa manfaat performa yang sepadan.</w:t>
       </w:r>
     </w:p>
     <w:p>
@@ -5591,7 +5591,7 @@
           <w:rFonts w:ascii="Calibri" w:hAnsi="Calibri"/>
           <w:color w:val="0F172A"/>
         </w:rPr>
-        <w:t>Temuan 5: STEM Menonjol dalam Performa Akademik, Sementara Paling Rentan terhadap Burnout</w:t>
+        <w:t>Temuan 5: Bidang Sains dan Teknologi (STEM) Menonjol dalam Performa Akademik, Sementara Paling Rentan terhadap Burnout</w:t>
       </w:r>
     </w:p>
     <w:p>
@@ -5605,7 +5605,7 @@
           <w:i w:val="0"/>
           <w:sz w:val="22"/>
         </w:rPr>
-        <w:t>Perbandingan antar bidang studi mengungkapkan pola yang menarik: mahasiswa STEM memiliki IPK akhir rata-rata tertinggi (3,363) dan Delta IPK terbesar (+0,217), namun sekaligus mencatat persentase burnout tinggi tertinggi di antara semua bidang studi (30,0%).</w:t>
+        <w:t>Perbandingan antar bidang studi mengungkapkan pola yang menarik: mahasiswa Sains/Teknologi (STEM) memiliki IPK akhir rata-rata tertinggi (3,363) dan Perubahan IPK terbesar (+0,217), namun sekaligus mencatat persentase burnout tinggi tertinggi di antara semua bidang studi (30,0%).</w:t>
       </w:r>
     </w:p>
     <w:tbl>
@@ -5626,6 +5626,111 @@
       <w:tr>
         <w:tc>
           <w:tcPr>
+            <w:tcW w:type="dxa" w:w="2592"/>
+            <w:shd w:val="clear" w:color="auto" w:fill="4F46E5"/>
+            <w:vAlign w:val="center"/>
+          </w:tcPr>
+          <w:p>
+            <w:pPr>
+              <w:jc w:val="center"/>
+            </w:pPr>
+            <w:r>
+              <w:rPr>
+                <w:rFonts w:ascii="Calibri" w:hAnsi="Calibri"/>
+                <w:b/>
+                <w:color w:val="FFFFFF"/>
+                <w:sz w:val="18"/>
+              </w:rPr>
+              <w:t>Bidang Studi</w:t>
+            </w:r>
+          </w:p>
+        </w:tc>
+        <w:tc>
+          <w:tcPr>
+            <w:tcW w:type="dxa" w:w="1152"/>
+            <w:shd w:val="clear" w:color="auto" w:fill="4F46E5"/>
+            <w:vAlign w:val="center"/>
+          </w:tcPr>
+          <w:p>
+            <w:pPr>
+              <w:jc w:val="center"/>
+            </w:pPr>
+            <w:r>
+              <w:rPr>
+                <w:rFonts w:ascii="Calibri" w:hAnsi="Calibri"/>
+                <w:b/>
+                <w:color w:val="FFFFFF"/>
+                <w:sz w:val="18"/>
+              </w:rPr>
+              <w:t>n</w:t>
+            </w:r>
+          </w:p>
+        </w:tc>
+        <w:tc>
+          <w:tcPr>
+            <w:tcW w:type="dxa" w:w="1152"/>
+            <w:shd w:val="clear" w:color="auto" w:fill="4F46E5"/>
+            <w:vAlign w:val="center"/>
+          </w:tcPr>
+          <w:p>
+            <w:pPr>
+              <w:jc w:val="center"/>
+            </w:pPr>
+            <w:r>
+              <w:rPr>
+                <w:rFonts w:ascii="Calibri" w:hAnsi="Calibri"/>
+                <w:b/>
+                <w:color w:val="FFFFFF"/>
+                <w:sz w:val="18"/>
+              </w:rPr>
+              <w:t>Porsi (%)</w:t>
+            </w:r>
+          </w:p>
+        </w:tc>
+        <w:tc>
+          <w:tcPr>
+            <w:tcW w:type="dxa" w:w="1584"/>
+            <w:shd w:val="clear" w:color="auto" w:fill="4F46E5"/>
+            <w:vAlign w:val="center"/>
+          </w:tcPr>
+          <w:p>
+            <w:pPr>
+              <w:jc w:val="center"/>
+            </w:pPr>
+            <w:r>
+              <w:rPr>
+                <w:rFonts w:ascii="Calibri" w:hAnsi="Calibri"/>
+                <w:b/>
+                <w:color w:val="FFFFFF"/>
+                <w:sz w:val="18"/>
+              </w:rPr>
+              <w:t>Rata-rata IPK</w:t>
+            </w:r>
+          </w:p>
+        </w:tc>
+        <w:tc>
+          <w:tcPr>
+            <w:tcW w:type="dxa" w:w="1440"/>
+            <w:shd w:val="clear" w:color="auto" w:fill="4F46E5"/>
+            <w:vAlign w:val="center"/>
+          </w:tcPr>
+          <w:p>
+            <w:pPr>
+              <w:jc w:val="center"/>
+            </w:pPr>
+            <w:r>
+              <w:rPr>
+                <w:rFonts w:ascii="Calibri" w:hAnsi="Calibri"/>
+                <w:b/>
+                <w:color w:val="FFFFFF"/>
+                <w:sz w:val="18"/>
+              </w:rPr>
+              <w:t>Perubahan IPK</w:t>
+            </w:r>
+          </w:p>
+        </w:tc>
+        <w:tc>
+          <w:tcPr>
             <w:tcW w:type="dxa" w:w="1872"/>
             <w:shd w:val="clear" w:color="auto" w:fill="4F46E5"/>
             <w:vAlign w:val="center"/>
@@ -5641,111 +5746,6 @@
                 <w:color w:val="FFFFFF"/>
                 <w:sz w:val="18"/>
               </w:rPr>
-              <w:t>Bidang Studi</w:t>
-            </w:r>
-          </w:p>
-        </w:tc>
-        <w:tc>
-          <w:tcPr>
-            <w:tcW w:type="dxa" w:w="1152"/>
-            <w:shd w:val="clear" w:color="auto" w:fill="4F46E5"/>
-            <w:vAlign w:val="center"/>
-          </w:tcPr>
-          <w:p>
-            <w:pPr>
-              <w:jc w:val="center"/>
-            </w:pPr>
-            <w:r>
-              <w:rPr>
-                <w:rFonts w:ascii="Calibri" w:hAnsi="Calibri"/>
-                <w:b/>
-                <w:color w:val="FFFFFF"/>
-                <w:sz w:val="18"/>
-              </w:rPr>
-              <w:t>n</w:t>
-            </w:r>
-          </w:p>
-        </w:tc>
-        <w:tc>
-          <w:tcPr>
-            <w:tcW w:type="dxa" w:w="1152"/>
-            <w:shd w:val="clear" w:color="auto" w:fill="4F46E5"/>
-            <w:vAlign w:val="center"/>
-          </w:tcPr>
-          <w:p>
-            <w:pPr>
-              <w:jc w:val="center"/>
-            </w:pPr>
-            <w:r>
-              <w:rPr>
-                <w:rFonts w:ascii="Calibri" w:hAnsi="Calibri"/>
-                <w:b/>
-                <w:color w:val="FFFFFF"/>
-                <w:sz w:val="18"/>
-              </w:rPr>
-              <w:t>Porsi (%)</w:t>
-            </w:r>
-          </w:p>
-        </w:tc>
-        <w:tc>
-          <w:tcPr>
-            <w:tcW w:type="dxa" w:w="1584"/>
-            <w:shd w:val="clear" w:color="auto" w:fill="4F46E5"/>
-            <w:vAlign w:val="center"/>
-          </w:tcPr>
-          <w:p>
-            <w:pPr>
-              <w:jc w:val="center"/>
-            </w:pPr>
-            <w:r>
-              <w:rPr>
-                <w:rFonts w:ascii="Calibri" w:hAnsi="Calibri"/>
-                <w:b/>
-                <w:color w:val="FFFFFF"/>
-                <w:sz w:val="18"/>
-              </w:rPr>
-              <w:t>Rata-rata IPK</w:t>
-            </w:r>
-          </w:p>
-        </w:tc>
-        <w:tc>
-          <w:tcPr>
-            <w:tcW w:type="dxa" w:w="1440"/>
-            <w:shd w:val="clear" w:color="auto" w:fill="4F46E5"/>
-            <w:vAlign w:val="center"/>
-          </w:tcPr>
-          <w:p>
-            <w:pPr>
-              <w:jc w:val="center"/>
-            </w:pPr>
-            <w:r>
-              <w:rPr>
-                <w:rFonts w:ascii="Calibri" w:hAnsi="Calibri"/>
-                <w:b/>
-                <w:color w:val="FFFFFF"/>
-                <w:sz w:val="18"/>
-              </w:rPr>
-              <w:t>Delta IPK</w:t>
-            </w:r>
-          </w:p>
-        </w:tc>
-        <w:tc>
-          <w:tcPr>
-            <w:tcW w:type="dxa" w:w="1872"/>
-            <w:shd w:val="clear" w:color="auto" w:fill="4F46E5"/>
-            <w:vAlign w:val="center"/>
-          </w:tcPr>
-          <w:p>
-            <w:pPr>
-              <w:jc w:val="center"/>
-            </w:pPr>
-            <w:r>
-              <w:rPr>
-                <w:rFonts w:ascii="Calibri" w:hAnsi="Calibri"/>
-                <w:b/>
-                <w:color w:val="FFFFFF"/>
-                <w:sz w:val="18"/>
-              </w:rPr>
               <w:t>Burnout Tinggi (%)</w:t>
             </w:r>
           </w:p>
@@ -5754,11 +5754,127 @@
       <w:tr>
         <w:tc>
           <w:tcPr>
+            <w:tcW w:type="dxa" w:w="2592"/>
+            <w:shd w:val="clear" w:color="auto" w:fill="F8FAFC"/>
+          </w:tcPr>
+          <w:p>
+            <w:pPr>
+              <w:jc w:val="left"/>
+            </w:pPr>
+            <w:r>
+              <w:rPr>
+                <w:rFonts w:ascii="Calibri" w:hAnsi="Calibri"/>
+                <w:color w:val="0F172A"/>
+                <w:sz w:val="18"/>
+              </w:rPr>
+              <w:t>Sains/Teknologi (STEM)</w:t>
+            </w:r>
+          </w:p>
+        </w:tc>
+        <w:tc>
+          <w:tcPr>
+            <w:tcW w:type="dxa" w:w="1152"/>
+            <w:shd w:val="clear" w:color="auto" w:fill="F8FAFC"/>
+          </w:tcPr>
+          <w:p>
+            <w:pPr>
+              <w:jc w:val="center"/>
+            </w:pPr>
+            <w:r>
+              <w:rPr>
+                <w:rFonts w:ascii="Calibri" w:hAnsi="Calibri"/>
+                <w:color w:val="0F172A"/>
+                <w:sz w:val="18"/>
+              </w:rPr>
+              <w:t>15.059</w:t>
+            </w:r>
+          </w:p>
+        </w:tc>
+        <w:tc>
+          <w:tcPr>
+            <w:tcW w:type="dxa" w:w="1152"/>
+            <w:shd w:val="clear" w:color="auto" w:fill="F8FAFC"/>
+          </w:tcPr>
+          <w:p>
+            <w:pPr>
+              <w:jc w:val="center"/>
+            </w:pPr>
+            <w:r>
+              <w:rPr>
+                <w:rFonts w:ascii="Calibri" w:hAnsi="Calibri"/>
+                <w:color w:val="0F172A"/>
+                <w:sz w:val="18"/>
+              </w:rPr>
+              <w:t>30,1%</w:t>
+            </w:r>
+          </w:p>
+        </w:tc>
+        <w:tc>
+          <w:tcPr>
+            <w:tcW w:type="dxa" w:w="1584"/>
+            <w:shd w:val="clear" w:color="auto" w:fill="F8FAFC"/>
+          </w:tcPr>
+          <w:p>
+            <w:pPr>
+              <w:jc w:val="center"/>
+            </w:pPr>
+            <w:r>
+              <w:rPr>
+                <w:rFonts w:ascii="Calibri" w:hAnsi="Calibri"/>
+                <w:color w:val="0F172A"/>
+                <w:sz w:val="18"/>
+              </w:rPr>
+              <w:t>3,363</w:t>
+            </w:r>
+          </w:p>
+        </w:tc>
+        <w:tc>
+          <w:tcPr>
+            <w:tcW w:type="dxa" w:w="1440"/>
+            <w:shd w:val="clear" w:color="auto" w:fill="F8FAFC"/>
+          </w:tcPr>
+          <w:p>
+            <w:pPr>
+              <w:jc w:val="center"/>
+            </w:pPr>
+            <w:r>
+              <w:rPr>
+                <w:rFonts w:ascii="Calibri" w:hAnsi="Calibri"/>
+                <w:color w:val="0F172A"/>
+                <w:sz w:val="18"/>
+              </w:rPr>
+              <w:t>+0,217</w:t>
+            </w:r>
+          </w:p>
+        </w:tc>
+        <w:tc>
+          <w:tcPr>
             <w:tcW w:type="dxa" w:w="1872"/>
             <w:shd w:val="clear" w:color="auto" w:fill="F8FAFC"/>
           </w:tcPr>
           <w:p>
             <w:pPr>
+              <w:jc w:val="center"/>
+            </w:pPr>
+            <w:r>
+              <w:rPr>
+                <w:rFonts w:ascii="Calibri" w:hAnsi="Calibri"/>
+                <w:color w:val="0F172A"/>
+                <w:sz w:val="18"/>
+              </w:rPr>
+              <w:t>30,0%</w:t>
+            </w:r>
+          </w:p>
+        </w:tc>
+      </w:tr>
+      <w:tr>
+        <w:tc>
+          <w:tcPr>
+            <w:tcW w:type="dxa" w:w="2592"/>
+            <w:shd w:val="clear" w:color="auto" w:fill="FFFFFF"/>
+          </w:tcPr>
+          <w:p>
+            <w:pPr>
               <w:jc w:val="left"/>
             </w:pPr>
             <w:r>
@@ -5767,7 +5883,123 @@
                 <w:color w:val="0F172A"/>
                 <w:sz w:val="18"/>
               </w:rPr>
-              <w:t>STEM</w:t>
+              <w:t>Bisnis</w:t>
+            </w:r>
+          </w:p>
+        </w:tc>
+        <w:tc>
+          <w:tcPr>
+            <w:tcW w:type="dxa" w:w="1152"/>
+            <w:shd w:val="clear" w:color="auto" w:fill="FFFFFF"/>
+          </w:tcPr>
+          <w:p>
+            <w:pPr>
+              <w:jc w:val="center"/>
+            </w:pPr>
+            <w:r>
+              <w:rPr>
+                <w:rFonts w:ascii="Calibri" w:hAnsi="Calibri"/>
+                <w:color w:val="0F172A"/>
+                <w:sz w:val="18"/>
+              </w:rPr>
+              <w:t>12.536</w:t>
+            </w:r>
+          </w:p>
+        </w:tc>
+        <w:tc>
+          <w:tcPr>
+            <w:tcW w:type="dxa" w:w="1152"/>
+            <w:shd w:val="clear" w:color="auto" w:fill="FFFFFF"/>
+          </w:tcPr>
+          <w:p>
+            <w:pPr>
+              <w:jc w:val="center"/>
+            </w:pPr>
+            <w:r>
+              <w:rPr>
+                <w:rFonts w:ascii="Calibri" w:hAnsi="Calibri"/>
+                <w:color w:val="0F172A"/>
+                <w:sz w:val="18"/>
+              </w:rPr>
+              <w:t>25,1%</w:t>
+            </w:r>
+          </w:p>
+        </w:tc>
+        <w:tc>
+          <w:tcPr>
+            <w:tcW w:type="dxa" w:w="1584"/>
+            <w:shd w:val="clear" w:color="auto" w:fill="FFFFFF"/>
+          </w:tcPr>
+          <w:p>
+            <w:pPr>
+              <w:jc w:val="center"/>
+            </w:pPr>
+            <w:r>
+              <w:rPr>
+                <w:rFonts w:ascii="Calibri" w:hAnsi="Calibri"/>
+                <w:color w:val="0F172A"/>
+                <w:sz w:val="18"/>
+              </w:rPr>
+              <w:t>3,336</w:t>
+            </w:r>
+          </w:p>
+        </w:tc>
+        <w:tc>
+          <w:tcPr>
+            <w:tcW w:type="dxa" w:w="1440"/>
+            <w:shd w:val="clear" w:color="auto" w:fill="FFFFFF"/>
+          </w:tcPr>
+          <w:p>
+            <w:pPr>
+              <w:jc w:val="center"/>
+            </w:pPr>
+            <w:r>
+              <w:rPr>
+                <w:rFonts w:ascii="Calibri" w:hAnsi="Calibri"/>
+                <w:color w:val="0F172A"/>
+                <w:sz w:val="18"/>
+              </w:rPr>
+              <w:t>+0,194</w:t>
+            </w:r>
+          </w:p>
+        </w:tc>
+        <w:tc>
+          <w:tcPr>
+            <w:tcW w:type="dxa" w:w="1872"/>
+            <w:shd w:val="clear" w:color="auto" w:fill="FFFFFF"/>
+          </w:tcPr>
+          <w:p>
+            <w:pPr>
+              <w:jc w:val="center"/>
+            </w:pPr>
+            <w:r>
+              <w:rPr>
+                <w:rFonts w:ascii="Calibri" w:hAnsi="Calibri"/>
+                <w:color w:val="0F172A"/>
+                <w:sz w:val="18"/>
+              </w:rPr>
+              <w:t>24,3%</w:t>
+            </w:r>
+          </w:p>
+        </w:tc>
+      </w:tr>
+      <w:tr>
+        <w:tc>
+          <w:tcPr>
+            <w:tcW w:type="dxa" w:w="2592"/>
+            <w:shd w:val="clear" w:color="auto" w:fill="F8FAFC"/>
+          </w:tcPr>
+          <w:p>
+            <w:pPr>
+              <w:jc w:val="left"/>
+            </w:pPr>
+            <w:r>
+              <w:rPr>
+                <w:rFonts w:ascii="Calibri" w:hAnsi="Calibri"/>
+                <w:color w:val="0F172A"/>
+                <w:sz w:val="18"/>
+              </w:rPr>
+              <w:t>Humaniora</w:t>
             </w:r>
           </w:p>
         </w:tc>
@@ -5786,7 +6018,7 @@
                 <w:color w:val="0F172A"/>
                 <w:sz w:val="18"/>
               </w:rPr>
-              <w:t>15.059</w:t>
+              <w:t>9.993</w:t>
             </w:r>
           </w:p>
         </w:tc>
@@ -5805,7 +6037,7 @@
                 <w:color w:val="0F172A"/>
                 <w:sz w:val="18"/>
               </w:rPr>
-              <w:t>30,1%</w:t>
+              <w:t>20,0%</w:t>
             </w:r>
           </w:p>
         </w:tc>
@@ -5824,7 +6056,7 @@
                 <w:color w:val="0F172A"/>
                 <w:sz w:val="18"/>
               </w:rPr>
-              <w:t>3,363</w:t>
+              <w:t>3,346</w:t>
             </w:r>
           </w:p>
         </w:tc>
@@ -5843,7 +6075,7 @@
                 <w:color w:val="0F172A"/>
                 <w:sz w:val="18"/>
               </w:rPr>
-              <w:t>+0,217</w:t>
+              <w:t>+0,198</w:t>
             </w:r>
           </w:p>
         </w:tc>
@@ -5862,7 +6094,7 @@
                 <w:color w:val="0F172A"/>
                 <w:sz w:val="18"/>
               </w:rPr>
-              <w:t>30,0%</w:t>
+              <w:t>20,7%</w:t>
             </w:r>
           </w:p>
         </w:tc>
@@ -5870,115 +6102,115 @@
       <w:tr>
         <w:tc>
           <w:tcPr>
+            <w:tcW w:type="dxa" w:w="2592"/>
+            <w:shd w:val="clear" w:color="auto" w:fill="FFFFFF"/>
+          </w:tcPr>
+          <w:p>
+            <w:pPr>
+              <w:jc w:val="left"/>
+            </w:pPr>
+            <w:r>
+              <w:rPr>
+                <w:rFonts w:ascii="Calibri" w:hAnsi="Calibri"/>
+                <w:color w:val="0F172A"/>
+                <w:sz w:val="18"/>
+              </w:rPr>
+              <w:t>Medis/Kesehatan</w:t>
+            </w:r>
+          </w:p>
+        </w:tc>
+        <w:tc>
+          <w:tcPr>
+            <w:tcW w:type="dxa" w:w="1152"/>
+            <w:shd w:val="clear" w:color="auto" w:fill="FFFFFF"/>
+          </w:tcPr>
+          <w:p>
+            <w:pPr>
+              <w:jc w:val="center"/>
+            </w:pPr>
+            <w:r>
+              <w:rPr>
+                <w:rFonts w:ascii="Calibri" w:hAnsi="Calibri"/>
+                <w:color w:val="0F172A"/>
+                <w:sz w:val="18"/>
+              </w:rPr>
+              <w:t>6.475</w:t>
+            </w:r>
+          </w:p>
+        </w:tc>
+        <w:tc>
+          <w:tcPr>
+            <w:tcW w:type="dxa" w:w="1152"/>
+            <w:shd w:val="clear" w:color="auto" w:fill="FFFFFF"/>
+          </w:tcPr>
+          <w:p>
+            <w:pPr>
+              <w:jc w:val="center"/>
+            </w:pPr>
+            <w:r>
+              <w:rPr>
+                <w:rFonts w:ascii="Calibri" w:hAnsi="Calibri"/>
+                <w:color w:val="0F172A"/>
+                <w:sz w:val="18"/>
+              </w:rPr>
+              <w:t>13,0%</w:t>
+            </w:r>
+          </w:p>
+        </w:tc>
+        <w:tc>
+          <w:tcPr>
+            <w:tcW w:type="dxa" w:w="1584"/>
+            <w:shd w:val="clear" w:color="auto" w:fill="FFFFFF"/>
+          </w:tcPr>
+          <w:p>
+            <w:pPr>
+              <w:jc w:val="center"/>
+            </w:pPr>
+            <w:r>
+              <w:rPr>
+                <w:rFonts w:ascii="Calibri" w:hAnsi="Calibri"/>
+                <w:color w:val="0F172A"/>
+                <w:sz w:val="18"/>
+              </w:rPr>
+              <w:t>3,353</w:t>
+            </w:r>
+          </w:p>
+        </w:tc>
+        <w:tc>
+          <w:tcPr>
+            <w:tcW w:type="dxa" w:w="1440"/>
+            <w:shd w:val="clear" w:color="auto" w:fill="FFFFFF"/>
+          </w:tcPr>
+          <w:p>
+            <w:pPr>
+              <w:jc w:val="center"/>
+            </w:pPr>
+            <w:r>
+              <w:rPr>
+                <w:rFonts w:ascii="Calibri" w:hAnsi="Calibri"/>
+                <w:color w:val="0F172A"/>
+                <w:sz w:val="18"/>
+              </w:rPr>
+              <w:t>+0,201</w:t>
+            </w:r>
+          </w:p>
+        </w:tc>
+        <w:tc>
+          <w:tcPr>
             <w:tcW w:type="dxa" w:w="1872"/>
             <w:shd w:val="clear" w:color="auto" w:fill="FFFFFF"/>
           </w:tcPr>
           <w:p>
             <w:pPr>
-              <w:jc w:val="left"/>
-            </w:pPr>
-            <w:r>
-              <w:rPr>
-                <w:rFonts w:ascii="Calibri" w:hAnsi="Calibri"/>
-                <w:color w:val="0F172A"/>
-                <w:sz w:val="18"/>
-              </w:rPr>
-              <w:t>Business</w:t>
-            </w:r>
-          </w:p>
-        </w:tc>
-        <w:tc>
-          <w:tcPr>
-            <w:tcW w:type="dxa" w:w="1152"/>
-            <w:shd w:val="clear" w:color="auto" w:fill="FFFFFF"/>
-          </w:tcPr>
-          <w:p>
-            <w:pPr>
-              <w:jc w:val="center"/>
-            </w:pPr>
-            <w:r>
-              <w:rPr>
-                <w:rFonts w:ascii="Calibri" w:hAnsi="Calibri"/>
-                <w:color w:val="0F172A"/>
-                <w:sz w:val="18"/>
-              </w:rPr>
-              <w:t>12.536</w:t>
-            </w:r>
-          </w:p>
-        </w:tc>
-        <w:tc>
-          <w:tcPr>
-            <w:tcW w:type="dxa" w:w="1152"/>
-            <w:shd w:val="clear" w:color="auto" w:fill="FFFFFF"/>
-          </w:tcPr>
-          <w:p>
-            <w:pPr>
-              <w:jc w:val="center"/>
-            </w:pPr>
-            <w:r>
-              <w:rPr>
-                <w:rFonts w:ascii="Calibri" w:hAnsi="Calibri"/>
-                <w:color w:val="0F172A"/>
-                <w:sz w:val="18"/>
-              </w:rPr>
-              <w:t>25,1%</w:t>
-            </w:r>
-          </w:p>
-        </w:tc>
-        <w:tc>
-          <w:tcPr>
-            <w:tcW w:type="dxa" w:w="1584"/>
-            <w:shd w:val="clear" w:color="auto" w:fill="FFFFFF"/>
-          </w:tcPr>
-          <w:p>
-            <w:pPr>
-              <w:jc w:val="center"/>
-            </w:pPr>
-            <w:r>
-              <w:rPr>
-                <w:rFonts w:ascii="Calibri" w:hAnsi="Calibri"/>
-                <w:color w:val="0F172A"/>
-                <w:sz w:val="18"/>
-              </w:rPr>
-              <w:t>3,336</w:t>
-            </w:r>
-          </w:p>
-        </w:tc>
-        <w:tc>
-          <w:tcPr>
-            <w:tcW w:type="dxa" w:w="1440"/>
-            <w:shd w:val="clear" w:color="auto" w:fill="FFFFFF"/>
-          </w:tcPr>
-          <w:p>
-            <w:pPr>
-              <w:jc w:val="center"/>
-            </w:pPr>
-            <w:r>
-              <w:rPr>
-                <w:rFonts w:ascii="Calibri" w:hAnsi="Calibri"/>
-                <w:color w:val="0F172A"/>
-                <w:sz w:val="18"/>
-              </w:rPr>
-              <w:t>+0,194</w:t>
-            </w:r>
-          </w:p>
-        </w:tc>
-        <w:tc>
-          <w:tcPr>
-            <w:tcW w:type="dxa" w:w="1872"/>
-            <w:shd w:val="clear" w:color="auto" w:fill="FFFFFF"/>
-          </w:tcPr>
-          <w:p>
-            <w:pPr>
-              <w:jc w:val="center"/>
-            </w:pPr>
-            <w:r>
-              <w:rPr>
-                <w:rFonts w:ascii="Calibri" w:hAnsi="Calibri"/>
-                <w:color w:val="0F172A"/>
-                <w:sz w:val="18"/>
-              </w:rPr>
-              <w:t>24,3%</w:t>
+              <w:jc w:val="center"/>
+            </w:pPr>
+            <w:r>
+              <w:rPr>
+                <w:rFonts w:ascii="Calibri" w:hAnsi="Calibri"/>
+                <w:color w:val="0F172A"/>
+                <w:sz w:val="18"/>
+              </w:rPr>
+              <w:t>23,2%</w:t>
             </w:r>
           </w:p>
         </w:tc>
@@ -5986,7 +6218,7 @@
       <w:tr>
         <w:tc>
           <w:tcPr>
-            <w:tcW w:type="dxa" w:w="1872"/>
+            <w:tcW w:type="dxa" w:w="2592"/>
             <w:shd w:val="clear" w:color="auto" w:fill="F8FAFC"/>
           </w:tcPr>
           <w:p>
@@ -5999,239 +6231,7 @@
                 <w:color w:val="0F172A"/>
                 <w:sz w:val="18"/>
               </w:rPr>
-              <w:t>Humanities</w:t>
-            </w:r>
-          </w:p>
-        </w:tc>
-        <w:tc>
-          <w:tcPr>
-            <w:tcW w:type="dxa" w:w="1152"/>
-            <w:shd w:val="clear" w:color="auto" w:fill="F8FAFC"/>
-          </w:tcPr>
-          <w:p>
-            <w:pPr>
-              <w:jc w:val="center"/>
-            </w:pPr>
-            <w:r>
-              <w:rPr>
-                <w:rFonts w:ascii="Calibri" w:hAnsi="Calibri"/>
-                <w:color w:val="0F172A"/>
-                <w:sz w:val="18"/>
-              </w:rPr>
-              <w:t>9.993</w:t>
-            </w:r>
-          </w:p>
-        </w:tc>
-        <w:tc>
-          <w:tcPr>
-            <w:tcW w:type="dxa" w:w="1152"/>
-            <w:shd w:val="clear" w:color="auto" w:fill="F8FAFC"/>
-          </w:tcPr>
-          <w:p>
-            <w:pPr>
-              <w:jc w:val="center"/>
-            </w:pPr>
-            <w:r>
-              <w:rPr>
-                <w:rFonts w:ascii="Calibri" w:hAnsi="Calibri"/>
-                <w:color w:val="0F172A"/>
-                <w:sz w:val="18"/>
-              </w:rPr>
-              <w:t>20,0%</w:t>
-            </w:r>
-          </w:p>
-        </w:tc>
-        <w:tc>
-          <w:tcPr>
-            <w:tcW w:type="dxa" w:w="1584"/>
-            <w:shd w:val="clear" w:color="auto" w:fill="F8FAFC"/>
-          </w:tcPr>
-          <w:p>
-            <w:pPr>
-              <w:jc w:val="center"/>
-            </w:pPr>
-            <w:r>
-              <w:rPr>
-                <w:rFonts w:ascii="Calibri" w:hAnsi="Calibri"/>
-                <w:color w:val="0F172A"/>
-                <w:sz w:val="18"/>
-              </w:rPr>
-              <w:t>3,346</w:t>
-            </w:r>
-          </w:p>
-        </w:tc>
-        <w:tc>
-          <w:tcPr>
-            <w:tcW w:type="dxa" w:w="1440"/>
-            <w:shd w:val="clear" w:color="auto" w:fill="F8FAFC"/>
-          </w:tcPr>
-          <w:p>
-            <w:pPr>
-              <w:jc w:val="center"/>
-            </w:pPr>
-            <w:r>
-              <w:rPr>
-                <w:rFonts w:ascii="Calibri" w:hAnsi="Calibri"/>
-                <w:color w:val="0F172A"/>
-                <w:sz w:val="18"/>
-              </w:rPr>
-              <w:t>+0,198</w:t>
-            </w:r>
-          </w:p>
-        </w:tc>
-        <w:tc>
-          <w:tcPr>
-            <w:tcW w:type="dxa" w:w="1872"/>
-            <w:shd w:val="clear" w:color="auto" w:fill="F8FAFC"/>
-          </w:tcPr>
-          <w:p>
-            <w:pPr>
-              <w:jc w:val="center"/>
-            </w:pPr>
-            <w:r>
-              <w:rPr>
-                <w:rFonts w:ascii="Calibri" w:hAnsi="Calibri"/>
-                <w:color w:val="0F172A"/>
-                <w:sz w:val="18"/>
-              </w:rPr>
-              <w:t>20,7%</w:t>
-            </w:r>
-          </w:p>
-        </w:tc>
-      </w:tr>
-      <w:tr>
-        <w:tc>
-          <w:tcPr>
-            <w:tcW w:type="dxa" w:w="1872"/>
-            <w:shd w:val="clear" w:color="auto" w:fill="FFFFFF"/>
-          </w:tcPr>
-          <w:p>
-            <w:pPr>
-              <w:jc w:val="left"/>
-            </w:pPr>
-            <w:r>
-              <w:rPr>
-                <w:rFonts w:ascii="Calibri" w:hAnsi="Calibri"/>
-                <w:color w:val="0F172A"/>
-                <w:sz w:val="18"/>
-              </w:rPr>
-              <w:t>Medical</w:t>
-            </w:r>
-          </w:p>
-        </w:tc>
-        <w:tc>
-          <w:tcPr>
-            <w:tcW w:type="dxa" w:w="1152"/>
-            <w:shd w:val="clear" w:color="auto" w:fill="FFFFFF"/>
-          </w:tcPr>
-          <w:p>
-            <w:pPr>
-              <w:jc w:val="center"/>
-            </w:pPr>
-            <w:r>
-              <w:rPr>
-                <w:rFonts w:ascii="Calibri" w:hAnsi="Calibri"/>
-                <w:color w:val="0F172A"/>
-                <w:sz w:val="18"/>
-              </w:rPr>
-              <w:t>6.475</w:t>
-            </w:r>
-          </w:p>
-        </w:tc>
-        <w:tc>
-          <w:tcPr>
-            <w:tcW w:type="dxa" w:w="1152"/>
-            <w:shd w:val="clear" w:color="auto" w:fill="FFFFFF"/>
-          </w:tcPr>
-          <w:p>
-            <w:pPr>
-              <w:jc w:val="center"/>
-            </w:pPr>
-            <w:r>
-              <w:rPr>
-                <w:rFonts w:ascii="Calibri" w:hAnsi="Calibri"/>
-                <w:color w:val="0F172A"/>
-                <w:sz w:val="18"/>
-              </w:rPr>
-              <w:t>13,0%</w:t>
-            </w:r>
-          </w:p>
-        </w:tc>
-        <w:tc>
-          <w:tcPr>
-            <w:tcW w:type="dxa" w:w="1584"/>
-            <w:shd w:val="clear" w:color="auto" w:fill="FFFFFF"/>
-          </w:tcPr>
-          <w:p>
-            <w:pPr>
-              <w:jc w:val="center"/>
-            </w:pPr>
-            <w:r>
-              <w:rPr>
-                <w:rFonts w:ascii="Calibri" w:hAnsi="Calibri"/>
-                <w:color w:val="0F172A"/>
-                <w:sz w:val="18"/>
-              </w:rPr>
-              <w:t>3,353</w:t>
-            </w:r>
-          </w:p>
-        </w:tc>
-        <w:tc>
-          <w:tcPr>
-            <w:tcW w:type="dxa" w:w="1440"/>
-            <w:shd w:val="clear" w:color="auto" w:fill="FFFFFF"/>
-          </w:tcPr>
-          <w:p>
-            <w:pPr>
-              <w:jc w:val="center"/>
-            </w:pPr>
-            <w:r>
-              <w:rPr>
-                <w:rFonts w:ascii="Calibri" w:hAnsi="Calibri"/>
-                <w:color w:val="0F172A"/>
-                <w:sz w:val="18"/>
-              </w:rPr>
-              <w:t>+0,201</w:t>
-            </w:r>
-          </w:p>
-        </w:tc>
-        <w:tc>
-          <w:tcPr>
-            <w:tcW w:type="dxa" w:w="1872"/>
-            <w:shd w:val="clear" w:color="auto" w:fill="FFFFFF"/>
-          </w:tcPr>
-          <w:p>
-            <w:pPr>
-              <w:jc w:val="center"/>
-            </w:pPr>
-            <w:r>
-              <w:rPr>
-                <w:rFonts w:ascii="Calibri" w:hAnsi="Calibri"/>
-                <w:color w:val="0F172A"/>
-                <w:sz w:val="18"/>
-              </w:rPr>
-              <w:t>23,2%</w:t>
-            </w:r>
-          </w:p>
-        </w:tc>
-      </w:tr>
-      <w:tr>
-        <w:tc>
-          <w:tcPr>
-            <w:tcW w:type="dxa" w:w="1872"/>
-            <w:shd w:val="clear" w:color="auto" w:fill="F8FAFC"/>
-          </w:tcPr>
-          <w:p>
-            <w:pPr>
-              <w:jc w:val="left"/>
-            </w:pPr>
-            <w:r>
-              <w:rPr>
-                <w:rFonts w:ascii="Calibri" w:hAnsi="Calibri"/>
-                <w:color w:val="0F172A"/>
-                <w:sz w:val="18"/>
-              </w:rPr>
-              <w:t>Arts</w:t>
+              <w:t>Seni/Desain</w:t>
             </w:r>
           </w:p>
         </w:tc>
@@ -6345,7 +6345,7 @@
           <w:color w:val="475569"/>
           <w:sz w:val="20"/>
         </w:rPr>
-        <w:t>Interpretasi: Karakteristik kurikulum STEM (tuntutan tinggi, pemecahan masalah kompleks) mendorong mahasiswanya menggunakan AI lebih intensif sekaligus mengalami beban kognitif lebih besar. Mahasiswa STEM membutuhkan pendampingan khusus untuk mengelola penggunaan AI secara strategis tanpa mengorbankan kesehatan mental.</w:t>
+        <w:t>Interpretasi: Karakteristik kurikulum Sains/Teknologi (STEM) mendorong mahasiswanya menggunakan AI lebih intensif sekaligus mengalami beban kognitif lebih besar. Mahasiswa STEM membutuhkan pendampingan khusus untuk mengelola penggunaan AI secara strategis tanpa mengorbankan kesehatan mental.</w:t>
       </w:r>
     </w:p>
     <w:p>
@@ -6371,7 +6371,7 @@
           <w:i w:val="0"/>
           <w:sz w:val="22"/>
         </w:rPr>
-        <w:t>Uji T-Test independen antara pengguna berbayar (n = 21.152, 42,3%) dan pengguna gratis (n = 28.843, 57,7%) menunjukkan perbedaan IPK yang sangat kecil dan tidak praktis bermakna.</w:t>
+        <w:t>Uji T-Test independen antara pengguna akun berbayar (n = 21.152, 42,3%) dan pengguna gratis (n = 28.843, 57,7%) menunjukkan perbedaan IPK yang sangat kecil dan tidak praktis bermakna.</w:t>
       </w:r>
     </w:p>
     <w:tbl>
@@ -6391,7 +6391,7 @@
       <w:tr>
         <w:tc>
           <w:tcPr>
-            <w:tcW w:type="dxa" w:w="2016"/>
+            <w:tcW w:type="dxa" w:w="2160"/>
             <w:shd w:val="clear" w:color="auto" w:fill="4F46E5"/>
             <w:vAlign w:val="center"/>
           </w:tcPr>
@@ -6475,7 +6475,7 @@
         </w:tc>
         <w:tc>
           <w:tcPr>
-            <w:tcW w:type="dxa" w:w="3456"/>
+            <w:tcW w:type="dxa" w:w="3312"/>
             <w:shd w:val="clear" w:color="auto" w:fill="4F46E5"/>
             <w:vAlign w:val="center"/>
           </w:tcPr>
@@ -6498,7 +6498,7 @@
       <w:tr>
         <w:tc>
           <w:tcPr>
-            <w:tcW w:type="dxa" w:w="2016"/>
+            <w:tcW w:type="dxa" w:w="2160"/>
             <w:shd w:val="clear" w:color="auto" w:fill="F8FAFC"/>
           </w:tcPr>
           <w:p>
@@ -6574,7 +6574,7 @@
         </w:tc>
         <w:tc>
           <w:tcPr>
-            <w:tcW w:type="dxa" w:w="3456"/>
+            <w:tcW w:type="dxa" w:w="3312"/>
             <w:shd w:val="clear" w:color="auto" w:fill="F8FAFC"/>
           </w:tcPr>
           <w:p>
@@ -6595,7 +6595,7 @@
       <w:tr>
         <w:tc>
           <w:tcPr>
-            <w:tcW w:type="dxa" w:w="2016"/>
+            <w:tcW w:type="dxa" w:w="2160"/>
             <w:shd w:val="clear" w:color="auto" w:fill="FFFFFF"/>
           </w:tcPr>
           <w:p>
@@ -6608,7 +6608,7 @@
                 <w:color w:val="0F172A"/>
                 <w:sz w:val="18"/>
               </w:rPr>
-              <w:t>Skor Retensi</w:t>
+              <w:t>Skor Retensi Pengetahuan</w:t>
             </w:r>
           </w:p>
         </w:tc>
@@ -6671,7 +6671,7 @@
         </w:tc>
         <w:tc>
           <w:tcPr>
-            <w:tcW w:type="dxa" w:w="3456"/>
+            <w:tcW w:type="dxa" w:w="3312"/>
             <w:shd w:val="clear" w:color="auto" w:fill="FFFFFF"/>
           </w:tcPr>
           <w:p>
@@ -6684,7 +6684,7 @@
                 <w:color w:val="0F172A"/>
                 <w:sz w:val="18"/>
               </w:rPr>
-              <w:t>Pengguna gratis lebih unggul dalam retensi</w:t>
+              <w:t>Pengguna gratis sedikit lebih unggul dalam retensi</w:t>
             </w:r>
           </w:p>
         </w:tc>
@@ -6703,7 +6703,7 @@
           <w:color w:val="475569"/>
           <w:sz w:val="20"/>
         </w:rPr>
-        <w:t>Interpretasi: Akses ke fitur premium AI tidak secara otomatis meningkatkan performa akademik. Mahasiswa gratis bahkan mencatat skor retensi lebih tinggi (76,07% vs 75,43%). Temuan ini mengimplikasikan bahwa kualitas cara penggunaan AI lebih penting daripada kemampuan berlangganan layanan premium.</w:t>
+        <w:t>Interpretasi: Akses ke fitur premium AI tidak secara otomatis meningkatkan performa akademik. Mahasiswa gratis bahkan mencatat skor retensi sedikit lebih tinggi (76,07% vs 75,43%). Temuan ini mengimplikasikan bahwa kualitas cara penggunaan AI lebih penting daripada kemampuan berlangganan layanan premium.</w:t>
       </w:r>
     </w:p>
     <w:p>
@@ -6905,7 +6905,7 @@
                 <w:color w:val="0F172A"/>
                 <w:sz w:val="18"/>
               </w:rPr>
-              <w:t>Light/Moderate User + Burnout Rendah</w:t>
+              <w:t>Pengguna Ringan/Sedang + Burnout Rendah</w:t>
             </w:r>
           </w:p>
         </w:tc>
@@ -7002,7 +7002,7 @@
                 <w:color w:val="0F172A"/>
                 <w:sz w:val="18"/>
               </w:rPr>
-              <w:t>Heavy User + Ketergantungan Tinggi</w:t>
+              <w:t>Pengguna Berat + Ketergantungan Tinggi</w:t>
             </w:r>
           </w:p>
         </w:tc>
@@ -7099,7 +7099,7 @@
                 <w:color w:val="0F172A"/>
                 <w:sz w:val="18"/>
               </w:rPr>
-              <w:t>Light User + Institusi Strict Ban</w:t>
+              <w:t>Pengguna Ringan + Institusi Larangan Ketat</w:t>
             </w:r>
           </w:p>
         </w:tc>
@@ -7196,7 +7196,7 @@
                 <w:color w:val="0F172A"/>
                 <w:sz w:val="18"/>
               </w:rPr>
-              <w:t>Moderate User + Belajar Mandiri Tinggi</w:t>
+              <w:t>Pengguna Sedang + Belajar Mandiri Tinggi</w:t>
             </w:r>
           </w:p>
         </w:tc>
@@ -7288,7 +7288,7 @@
       <w:tr>
         <w:tc>
           <w:tcPr>
-            <w:tcW w:type="dxa" w:w="1728"/>
+            <w:tcW w:type="dxa" w:w="2160"/>
             <w:shd w:val="clear" w:color="auto" w:fill="4F46E5"/>
             <w:vAlign w:val="center"/>
           </w:tcPr>
@@ -7351,7 +7351,7 @@
         </w:tc>
         <w:tc>
           <w:tcPr>
-            <w:tcW w:type="dxa" w:w="5760"/>
+            <w:tcW w:type="dxa" w:w="5328"/>
             <w:shd w:val="clear" w:color="auto" w:fill="4F46E5"/>
             <w:vAlign w:val="center"/>
           </w:tcPr>
@@ -7374,7 +7374,7 @@
       <w:tr>
         <w:tc>
           <w:tcPr>
-            <w:tcW w:type="dxa" w:w="1728"/>
+            <w:tcW w:type="dxa" w:w="2160"/>
             <w:shd w:val="clear" w:color="auto" w:fill="F8FAFC"/>
           </w:tcPr>
           <w:p>
@@ -7387,7 +7387,7 @@
                 <w:color w:val="0F172A"/>
                 <w:sz w:val="18"/>
               </w:rPr>
-              <w:t>Freshman</w:t>
+              <w:t>Freshman (Tahun 1)</w:t>
             </w:r>
           </w:p>
         </w:tc>
@@ -7431,7 +7431,7 @@
         </w:tc>
         <w:tc>
           <w:tcPr>
-            <w:tcW w:type="dxa" w:w="5760"/>
+            <w:tcW w:type="dxa" w:w="5328"/>
             <w:shd w:val="clear" w:color="auto" w:fill="F8FAFC"/>
           </w:tcPr>
           <w:p>
@@ -7452,7 +7452,7 @@
       <w:tr>
         <w:tc>
           <w:tcPr>
-            <w:tcW w:type="dxa" w:w="1728"/>
+            <w:tcW w:type="dxa" w:w="2160"/>
             <w:shd w:val="clear" w:color="auto" w:fill="FFFFFF"/>
           </w:tcPr>
           <w:p>
@@ -7465,7 +7465,7 @@
                 <w:color w:val="0F172A"/>
                 <w:sz w:val="18"/>
               </w:rPr>
-              <w:t>Sophomore</w:t>
+              <w:t>Sophomore (Tahun 2)</w:t>
             </w:r>
           </w:p>
         </w:tc>
@@ -7509,7 +7509,7 @@
         </w:tc>
         <w:tc>
           <w:tcPr>
-            <w:tcW w:type="dxa" w:w="5760"/>
+            <w:tcW w:type="dxa" w:w="5328"/>
             <w:shd w:val="clear" w:color="auto" w:fill="FFFFFF"/>
           </w:tcPr>
           <w:p>
@@ -7530,7 +7530,7 @@
       <w:tr>
         <w:tc>
           <w:tcPr>
-            <w:tcW w:type="dxa" w:w="1728"/>
+            <w:tcW w:type="dxa" w:w="2160"/>
             <w:shd w:val="clear" w:color="auto" w:fill="F8FAFC"/>
           </w:tcPr>
           <w:p>
@@ -7543,7 +7543,7 @@
                 <w:color w:val="0F172A"/>
                 <w:sz w:val="18"/>
               </w:rPr>
-              <w:t>Junior</w:t>
+              <w:t>Junior (Tahun 3)</w:t>
             </w:r>
           </w:p>
         </w:tc>
@@ -7587,7 +7587,7 @@
         </w:tc>
         <w:tc>
           <w:tcPr>
-            <w:tcW w:type="dxa" w:w="5760"/>
+            <w:tcW w:type="dxa" w:w="5328"/>
             <w:shd w:val="clear" w:color="auto" w:fill="F8FAFC"/>
           </w:tcPr>
           <w:p>
@@ -7608,7 +7608,7 @@
       <w:tr>
         <w:tc>
           <w:tcPr>
-            <w:tcW w:type="dxa" w:w="1728"/>
+            <w:tcW w:type="dxa" w:w="2160"/>
             <w:shd w:val="clear" w:color="auto" w:fill="FFFFFF"/>
           </w:tcPr>
           <w:p>
@@ -7621,7 +7621,7 @@
                 <w:color w:val="0F172A"/>
                 <w:sz w:val="18"/>
               </w:rPr>
-              <w:t>Senior</w:t>
+              <w:t>Senior (Tahun 4)</w:t>
             </w:r>
           </w:p>
         </w:tc>
@@ -7665,7 +7665,7 @@
         </w:tc>
         <w:tc>
           <w:tcPr>
-            <w:tcW w:type="dxa" w:w="5760"/>
+            <w:tcW w:type="dxa" w:w="5328"/>
             <w:shd w:val="clear" w:color="auto" w:fill="FFFFFF"/>
           </w:tcPr>
           <w:p>
@@ -7686,7 +7686,7 @@
       <w:tr>
         <w:tc>
           <w:tcPr>
-            <w:tcW w:type="dxa" w:w="1728"/>
+            <w:tcW w:type="dxa" w:w="2160"/>
             <w:shd w:val="clear" w:color="auto" w:fill="F8FAFC"/>
           </w:tcPr>
           <w:p>
@@ -7699,7 +7699,7 @@
                 <w:color w:val="0F172A"/>
                 <w:sz w:val="18"/>
               </w:rPr>
-              <w:t>Graduate</w:t>
+              <w:t>Graduate (Pascasarjana)</w:t>
             </w:r>
           </w:p>
         </w:tc>
@@ -7743,7 +7743,7 @@
         </w:tc>
         <w:tc>
           <w:tcPr>
-            <w:tcW w:type="dxa" w:w="5760"/>
+            <w:tcW w:type="dxa" w:w="5328"/>
             <w:shd w:val="clear" w:color="auto" w:fill="F8FAFC"/>
           </w:tcPr>
           <w:p>
@@ -7756,7 +7756,7 @@
                 <w:color w:val="0F172A"/>
                 <w:sz w:val="18"/>
               </w:rPr>
-              <w:t>Penggunaan AI paling strategis; heavy user proporsional lebih tinggi</w:t>
+              <w:t>Penggunaan AI paling strategis; proporsi pengguna berat lebih tinggi</w:t>
             </w:r>
           </w:p>
         </w:tc>
@@ -7816,7 +7816,7 @@
           <w:i w:val="0"/>
           <w:sz w:val="22"/>
         </w:rPr>
-        <w:t>Mengganti kebijakan Strict Ban dengan kerangka penggunaan AI yang terintegrasi dan bertanggung jawab pada seluruh institusi mitra konsultan dalam 1 semester pertama implementasi.</w:t>
+        <w:t>Mengganti kebijakan Larangan Ketat dengan kerangka penggunaan AI yang terintegrasi dan bertanggung jawab pada seluruh institusi mitra konsultan dalam 1 semester pertama implementasi.</w:t>
       </w:r>
     </w:p>
     <w:tbl>
@@ -7909,7 +7909,7 @@
                 <w:color w:val="0F172A"/>
                 <w:sz w:val="18"/>
               </w:rPr>
-              <w:t>• Penurunan % burnout tinggi dari 29,8% (Strict Ban) menjadi &lt; 25%</w:t>
+              <w:t>• Penurunan % burnout tinggi dari 29,8% (Larangan Ketat) menjadi &lt; 25%</w:t>
               <w:br/>
               <w:t>• Peningkatan rata-rata IPK sebesar 0,02–0,05 poin dalam satu semester</w:t>
             </w:r>
@@ -7955,7 +7955,7 @@
               <w:br/>
               <w:t>• Latih 100% dosen dalam teknik integrasi AI ke kurikulum</w:t>
               <w:br/>
-              <w:t>• Implementasi AI Literacy Workshop wajib 2×/semester untuk mahasiswa baru</w:t>
+              <w:t>• Implementasi Workshop Literasi AI wajib 2×/semester untuk mahasiswa baru</w:t>
             </w:r>
           </w:p>
         </w:tc>
@@ -8093,7 +8093,7 @@
           <w:rFonts w:ascii="Calibri" w:hAnsi="Calibri"/>
           <w:color w:val="0F172A"/>
         </w:rPr>
-        <w:t>Rekomendasi 2: Program Intervensi Khusus untuk Heavy User Berisiko Burnout</w:t>
+        <w:t>Rekomendasi 2: Program Intervensi Khusus untuk Pengguna Berat Berisiko Burnout</w:t>
       </w:r>
     </w:p>
     <w:p>
@@ -8107,7 +8107,7 @@
           <w:i w:val="0"/>
           <w:sz w:val="22"/>
         </w:rPr>
-        <w:t>Membentuk sistem deteksi dini dan pendampingan mahasiswa Heavy User (&gt;15 jam/minggu) yang memiliki indikator burnout tinggi dan ketergantungan AI di atas rata-rata.</w:t>
+        <w:t>Membentuk sistem deteksi dini dan pendampingan mahasiswa Pengguna Berat (&gt;15 jam/minggu) yang memiliki indikator burnout tinggi dan ketergantungan AI di atas rata-rata.</w:t>
       </w:r>
     </w:p>
     <w:tbl>
@@ -8200,9 +8200,9 @@
                 <w:color w:val="0F172A"/>
                 <w:sz w:val="18"/>
               </w:rPr>
-              <w:t>• Identifikasi minimum 80% mahasiswa Heavy User di setiap angkatan</w:t>
+              <w:t>• Identifikasi minimum 80% mahasiswa Pengguna Berat di setiap angkatan</w:t>
               <w:br/>
-              <w:t>• Penurunan % burnout tinggi Heavy User dari 64,8% menjadi &lt; 45% dalam 2 semester</w:t>
+              <w:t>• Penurunan % burnout tinggi Pengguna Berat dari 64,8% menjadi &lt; 45% dalam 2 semester</w:t>
             </w:r>
           </w:p>
         </w:tc>
@@ -8244,9 +8244,9 @@
               </w:rPr>
               <w:t>• Integrasikan survei penggunaan AI ke sistem akademik (per 4 minggu)</w:t>
               <w:br/>
-              <w:t>• Wajibkan konseling AI-wellness bagi mahasiswa dengan skor ketergantungan &gt; 7/10</w:t>
+              <w:t>• Wajibkan konseling kesehatan mental bagi mahasiswa dengan skor ketergantungan &gt; 7/10</w:t>
               <w:br/>
-              <w:t>• Desain modul "Digital Detox Plan" dengan jadwal belajar mandiri terstruktur</w:t>
+              <w:t>• Desain modul "Rencana Detoks Digital" dengan jadwal belajar mandiri terstruktur</w:t>
               <w:br/>
               <w:t>• Libatkan psikolog kampus dalam modul pengelolaan stres akademik</w:t>
             </w:r>
@@ -8288,9 +8288,9 @@
                 <w:color w:val="0F172A"/>
                 <w:sz w:val="18"/>
               </w:rPr>
-              <w:t>• % Heavy User yang berhasil diturunkan ke Moderate User ≥ 30%</w:t>
+              <w:t>• % Pengguna Berat yang berhasil diturunkan ke Pengguna Sedang ≥ 30%</w:t>
               <w:br/>
-              <w:t>• Rata-rata skor ketergantungan AI Heavy User &lt; 5,0 (dari 5,73)</w:t>
+              <w:t>• Rata-rata skor ketergantungan AI Pengguna Berat &lt; 5,0 (dari 5,73)</w:t>
             </w:r>
           </w:p>
         </w:tc>
@@ -8400,7 +8400,7 @@
           <w:i w:val="0"/>
           <w:sz w:val="22"/>
         </w:rPr>
-        <w:t>Meningkatkan kapasitas belajar mandiri (Traditional Study Hours) mahasiswa sebagai pengimbang yang terbukti meningkatkan retensi pengetahuan dan IPK secara signifikan, mengingat korelasinya (r = 0,138) lebih kuat dibandingkan jam AI (r = -0,019).</w:t>
+        <w:t>Meningkatkan kapasitas belajar mandiri mahasiswa sebagai pengimbang yang terbukti meningkatkan retensi pengetahuan dan IPK secara signifikan, mengingat korelasinya (r = 0,138) lebih kuat dibandingkan jam AI (r = -0,019).</w:t>
       </w:r>
     </w:p>
     <w:tbl>
@@ -8810,7 +8810,7 @@
                 <w:color w:val="0F172A"/>
                 <w:sz w:val="18"/>
               </w:rPr>
-              <w:t>Data Self-Report</w:t>
+              <w:t>Data Survei Mandiri</w:t>
             </w:r>
           </w:p>
         </w:tc>
@@ -8829,7 +8829,7 @@
                 <w:color w:val="0F172A"/>
                 <w:sz w:val="18"/>
               </w:rPr>
-              <w:t>Seluruh data bersumber dari survei mandiri mahasiswa. Kemungkinan adanya response bias (kecenderungan over/under-report penggunaan AI) tidak dapat dikendalikan sepenuhnya.</w:t>
+              <w:t>Seluruh data bersumber dari survei mandiri mahasiswa. Kemungkinan adanya bias jawaban (kecenderungan melaporkan penggunaan AI secara berlebih/kurang) tidak dapat dikendalikan sepenuhnya.</w:t>
             </w:r>
           </w:p>
         </w:tc>
@@ -8869,7 +8869,7 @@
                 <w:color w:val="0F172A"/>
                 <w:sz w:val="18"/>
               </w:rPr>
-              <w:t>Kausalitas vs Korelasi</w:t>
+              <w:t>Hubungan Korelasional</w:t>
             </w:r>
           </w:p>
         </w:tc>
@@ -8888,7 +8888,7 @@
                 <w:color w:val="0F172A"/>
                 <w:sz w:val="18"/>
               </w:rPr>
-              <w:t>Analisis ini bersifat korelasional, bukan eksperimental. Hubungan antara intensitas AI dan performa akademik belum dapat diklaim sebagai hubungan kausal.</w:t>
+              <w:t>Analisis ini bersifat korelasional, bukan eksperimental. Hubungan antara intensitas AI dan performa akademik belum dapat diklaim sebagai hubungan sebab-akibat (kausalitas).</w:t>
             </w:r>
           </w:p>
         </w:tc>
@@ -8928,7 +8928,7 @@
                 <w:color w:val="0F172A"/>
                 <w:sz w:val="18"/>
               </w:rPr>
-              <w:t>Konteks Institusi Tunggal Siklus</w:t>
+              <w:t>Konteks Satu Semester</w:t>
             </w:r>
           </w:p>
         </w:tc>
@@ -8947,7 +8947,7 @@
                 <w:color w:val="0F172A"/>
                 <w:sz w:val="18"/>
               </w:rPr>
-              <w:t>Data mencerminkan satu semester akademik tanpa data longitudinal. Perubahan jangka panjang dalam perilaku penggunaan AI belum dapat diobservasi.</w:t>
+              <w:t>Data mencerminkan satu semester akademik tanpa data jangka panjang (longitudinal). Perubahan pola perilaku penggunaan AI dalam jangka panjang belum dapat diobservasi.</w:t>
             </w:r>
           </w:p>
         </w:tc>
@@ -8987,7 +8987,7 @@
                 <w:color w:val="0F172A"/>
                 <w:sz w:val="18"/>
               </w:rPr>
-              <w:t>Keberagaman Alat AI</w:t>
+              <w:t>Definisi Keberagaman Alat</w:t>
             </w:r>
           </w:p>
         </w:tc>
@@ -9006,7 +9006,7 @@
                 <w:color w:val="0F172A"/>
                 <w:sz w:val="18"/>
               </w:rPr>
-              <w:t>Variabel Tool_Diversity hanya merepresentasikan jumlah tools (1–5), bukan kualitas atau cara penggunaannya, sehingga kontribusi jenis AI tertentu tidak dapat dibedakan.</w:t>
+              <w:t>Indikator Keberagaman Alat AI hanya merepresentasikan jumlah alat (1–5), bukan kualitas atau cara penggunaannya, sehingga kontribusi jenis AI tertentu tidak dapat dibedakan.</w:t>
             </w:r>
           </w:p>
         </w:tc>
@@ -9046,7 +9046,7 @@
                 <w:color w:val="0F172A"/>
                 <w:sz w:val="18"/>
               </w:rPr>
-              <w:t>Potensi Confounding Variables</w:t>
+              <w:t>Potensi Variabel Perancu</w:t>
             </w:r>
           </w:p>
         </w:tc>
@@ -9124,7 +9124,7 @@
                 <w:color w:val="0F172A"/>
                 <w:sz w:val="18"/>
               </w:rPr>
-              <w:t>Dataset berasal dari "berbagai perguruan tinggi internasional" tanpa spesifikasi negara, sehingga generalisasi ke konteks pendidikan tinggi Indonesia memerlukan kehati-hatian.</w:t>
+              <w:t>Dataset berasal dari berbagai perguruan tinggi internasional tanpa spesifikasi negara, sehingga replikasi ke konteks pendidikan tinggi di Indonesia memerlukan penyesuaian.</w:t>
             </w:r>
           </w:p>
         </w:tc>
@@ -9233,7 +9233,7 @@
                 <w:color w:val="0F172A"/>
                 <w:sz w:val="18"/>
               </w:rPr>
-              <w:t>Pantau perubahan performa dan kesehatan mental mahasiswa selama 2–4 semester untuk mengamati tren jangka panjang penggunaan AI.</w:t>
+              <w:t>Pantau perubahan performa dan kesehatan mental mahasiswa selama beberapa semester untuk mengamati tren jangka panjang penggunaan AI.</w:t>
             </w:r>
           </w:p>
         </w:tc>
@@ -9273,7 +9273,7 @@
                 <w:color w:val="0F172A"/>
                 <w:sz w:val="18"/>
               </w:rPr>
-              <w:t>Rancang studi quasi-eksperimental dengan kelompok kontrol (non-AI) dan kelompok perlakuan (AI-terintegrasi) untuk membuktikan kausalitas.</w:t>
+              <w:t>Rancang studi eksperimental dengan kelompok kontrol (tanpa AI) dan kelompok perlakuan (dengan integrasi AI) untuk membuktikan hubungan sebab-akibat.</w:t>
             </w:r>
           </w:p>
         </w:tc>
@@ -9294,7 +9294,7 @@
                 <w:color w:val="0F172A"/>
                 <w:sz w:val="18"/>
               </w:rPr>
-              <w:t>Analisis Moderasi</w:t>
+              <w:t>Analisis Peran Moderasi</w:t>
             </w:r>
           </w:p>
         </w:tc>
@@ -9313,7 +9313,7 @@
                 <w:color w:val="0F172A"/>
                 <w:sz w:val="18"/>
               </w:rPr>
-              <w:t>Teliti apakah faktor seperti kemampuan prompt engineering, jenis AI yang digunakan, dan tingkat kesulitan mata kuliah memoderasi hubungan AI dengan IPK.</w:t>
+              <w:t>Teliti apakah faktor seperti kemampuan rekayasa prompt, jenis alat AI yang digunakan, dan tingkat kesulitan mata kuliah memoderasi hubungan AI dengan IPK.</w:t>
             </w:r>
           </w:p>
         </w:tc>
@@ -9353,7 +9353,7 @@
                 <w:color w:val="0F172A"/>
                 <w:sz w:val="18"/>
               </w:rPr>
-              <w:t>Kembangkan indikator kualitas penggunaan AI (bukan hanya kuantitas jam) melalui log interaksi atau think-aloud protocol.</w:t>
+              <w:t>Kembangkan indikator kualitas penggunaan AI (bukan hanya kuantitas jam) melalui log interaksi atau metode kualitatif.</w:t>
             </w:r>
           </w:p>
         </w:tc>
@@ -9374,7 +9374,7 @@
                 <w:color w:val="0F172A"/>
                 <w:sz w:val="18"/>
               </w:rPr>
-              <w:t>Konteks Indonesia</w:t>
+              <w:t>Konteks Lokal Indonesia</w:t>
             </w:r>
           </w:p>
         </w:tc>
@@ -9393,7 +9393,7 @@
                 <w:color w:val="0F172A"/>
                 <w:sz w:val="18"/>
               </w:rPr>
-              <w:t>Replikasi studi pada institusi pendidikan tinggi di Indonesia untuk mendapatkan temuan yang relevan secara lokal, mempertimbangkan infrastruktur digital dan kebijakan AI nasional.</w:t>
+              <w:t>Replikasi studi pada institusi pendidikan tinggi di Indonesia untuk mendapatkan temuan yang relevan secara nasional, mempertimbangkan infrastruktur digital lokal.</w:t>
             </w:r>
           </w:p>
         </w:tc>
@@ -9414,7 +9414,7 @@
                 <w:color w:val="0F172A"/>
                 <w:sz w:val="18"/>
               </w:rPr>
-              <w:t>Model Prediktif</w:t>
+              <w:t>Model Prediksi Risiko</w:t>
             </w:r>
           </w:p>
         </w:tc>
@@ -9433,7 +9433,7 @@
                 <w:color w:val="0F172A"/>
                 <w:sz w:val="18"/>
               </w:rPr>
-              <w:t>Kembangkan model machine learning untuk deteksi dini mahasiswa berisiko burnout berdasarkan pola penggunaan AI sejak semester pertama.</w:t>
+              <w:t>Kembangkan model pembelajaran mesin (machine learning) untuk deteksi dini mahasiswa berisiko burnout berdasarkan pola aktivitas digital mereka.</w:t>
             </w:r>
           </w:p>
         </w:tc>
@@ -9500,7 +9500,7 @@
                 <w:color w:val="FFFFFF"/>
                 <w:sz w:val="18"/>
               </w:rPr>
-              <w:t>Nama Kolom</w:t>
+              <w:t>Nama Indikator</w:t>
             </w:r>
           </w:p>
         </w:tc>
@@ -9605,7 +9605,7 @@
                 <w:color w:val="0F172A"/>
                 <w:sz w:val="18"/>
               </w:rPr>
-              <w:t>Student_ID</w:t>
+              <w:t>ID Mahasiswa</w:t>
             </w:r>
           </w:p>
         </w:tc>
@@ -9681,7 +9681,7 @@
                 <w:color w:val="0F172A"/>
                 <w:sz w:val="18"/>
               </w:rPr>
-              <w:t>Tidak ada missing</w:t>
+              <w:t>Tidak ada nilai kosong</w:t>
             </w:r>
           </w:p>
         </w:tc>
@@ -9702,7 +9702,7 @@
                 <w:color w:val="0F172A"/>
                 <w:sz w:val="18"/>
               </w:rPr>
-              <w:t>Major_Category</w:t>
+              <w:t>Kategori Bidang Studi</w:t>
             </w:r>
           </w:p>
         </w:tc>
@@ -9740,7 +9740,7 @@
                 <w:color w:val="0F172A"/>
                 <w:sz w:val="18"/>
               </w:rPr>
-              <w:t>Bidang studi mahasiswa</w:t>
+              <w:t>Bidang studi utama mahasiswa</w:t>
             </w:r>
           </w:p>
         </w:tc>
@@ -9759,7 +9759,7 @@
                 <w:color w:val="0F172A"/>
                 <w:sz w:val="18"/>
               </w:rPr>
-              <w:t>STEM, Business, Humanities, Medical, Arts</w:t>
+              <w:t>STEM, Bisnis, Humaniora, Medis, Seni</w:t>
             </w:r>
           </w:p>
         </w:tc>
@@ -9799,7 +9799,7 @@
                 <w:color w:val="0F172A"/>
                 <w:sz w:val="18"/>
               </w:rPr>
-              <w:t>Year_of_Study</w:t>
+              <w:t>Tahun Studi</w:t>
             </w:r>
           </w:p>
         </w:tc>
@@ -9896,7 +9896,7 @@
                 <w:color w:val="0F172A"/>
                 <w:sz w:val="18"/>
               </w:rPr>
-              <w:t>Pre_Semester_GPA</w:t>
+              <w:t>IPK Awal</w:t>
             </w:r>
           </w:p>
         </w:tc>
@@ -9934,7 +9934,7 @@
                 <w:color w:val="0F172A"/>
                 <w:sz w:val="18"/>
               </w:rPr>
-              <w:t>IPK mahasiswa sebelum semester</w:t>
+              <w:t>IPK mahasiswa sebelum semester berjalan</w:t>
             </w:r>
           </w:p>
         </w:tc>
@@ -9953,7 +9953,7 @@
                 <w:color w:val="0F172A"/>
                 <w:sz w:val="18"/>
               </w:rPr>
-              <w:t>1.183 – 3.998</w:t>
+              <w:t>1,183 – 3,998</w:t>
             </w:r>
           </w:p>
         </w:tc>
@@ -9972,7 +9972,7 @@
                 <w:color w:val="0F172A"/>
                 <w:sz w:val="18"/>
               </w:rPr>
-              <w:t>Mean = 3.146</w:t>
+              <w:t>Rata-rata = 3,146</w:t>
             </w:r>
           </w:p>
         </w:tc>
@@ -9993,7 +9993,7 @@
                 <w:color w:val="0F172A"/>
                 <w:sz w:val="18"/>
               </w:rPr>
-              <w:t>Post_Semester_GPA</w:t>
+              <w:t>IPK Akhir</w:t>
             </w:r>
           </w:p>
         </w:tc>
@@ -10031,7 +10031,7 @@
                 <w:color w:val="0F172A"/>
                 <w:sz w:val="18"/>
               </w:rPr>
-              <w:t>IPK mahasiswa setelah semester</w:t>
+              <w:t>IPK mahasiswa setelah semester berjalan</w:t>
             </w:r>
           </w:p>
         </w:tc>
@@ -10050,7 +10050,7 @@
                 <w:color w:val="0F172A"/>
                 <w:sz w:val="18"/>
               </w:rPr>
-              <w:t>1.000 – 4.000</w:t>
+              <w:t>1,000 – 4,000</w:t>
             </w:r>
           </w:p>
         </w:tc>
@@ -10069,7 +10069,7 @@
                 <w:color w:val="0F172A"/>
                 <w:sz w:val="18"/>
               </w:rPr>
-              <w:t>Mean = 3.349</w:t>
+              <w:t>Rata-rata = 3,349</w:t>
             </w:r>
           </w:p>
         </w:tc>
@@ -10090,7 +10090,7 @@
                 <w:color w:val="0F172A"/>
                 <w:sz w:val="18"/>
               </w:rPr>
-              <w:t>Delta_IPK</w:t>
+              <w:t>Perubahan IPK (Delta IPK)</w:t>
             </w:r>
           </w:p>
         </w:tc>
@@ -10147,7 +10147,7 @@
                 <w:color w:val="0F172A"/>
                 <w:sz w:val="18"/>
               </w:rPr>
-              <w:t>-0.924 – 1.008</w:t>
+              <w:t>-0,924 – 1,008</w:t>
             </w:r>
           </w:p>
         </w:tc>
@@ -10166,7 +10166,7 @@
                 <w:color w:val="0F172A"/>
                 <w:sz w:val="18"/>
               </w:rPr>
-              <w:t>Mean = +0.203</w:t>
+              <w:t>Rata-rata = +0,203</w:t>
             </w:r>
           </w:p>
         </w:tc>
@@ -10187,7 +10187,7 @@
                 <w:color w:val="0F172A"/>
                 <w:sz w:val="18"/>
               </w:rPr>
-              <w:t>Weekly_GenAI_Hours</w:t>
+              <w:t>Jam Penggunaan AI Mingguan</w:t>
             </w:r>
           </w:p>
         </w:tc>
@@ -10225,7 +10225,7 @@
                 <w:color w:val="0F172A"/>
                 <w:sz w:val="18"/>
               </w:rPr>
-              <w:t>Jam penggunaan AI per minggu</w:t>
+              <w:t>Rata-rata jam penggunaan AI per minggu</w:t>
             </w:r>
           </w:p>
         </w:tc>
@@ -10244,7 +10244,7 @@
                 <w:color w:val="0F172A"/>
                 <w:sz w:val="18"/>
               </w:rPr>
-              <w:t>0.000 – 40.000</w:t>
+              <w:t>0,000 – 40,000</w:t>
             </w:r>
           </w:p>
         </w:tc>
@@ -10263,7 +10263,7 @@
                 <w:color w:val="0F172A"/>
                 <w:sz w:val="18"/>
               </w:rPr>
-              <w:t>Mean = 8.427</w:t>
+              <w:t>Rata-rata = 8,427</w:t>
             </w:r>
           </w:p>
         </w:tc>
@@ -10284,7 +10284,7 @@
                 <w:color w:val="0F172A"/>
                 <w:sz w:val="18"/>
               </w:rPr>
-              <w:t>Primary_Use_Case</w:t>
+              <w:t>Tujuan Utama Penggunaan AI</w:t>
             </w:r>
           </w:p>
         </w:tc>
@@ -10322,7 +10322,7 @@
                 <w:color w:val="0F172A"/>
                 <w:sz w:val="18"/>
               </w:rPr>
-              <w:t>Tujuan utama penggunaan AI</w:t>
+              <w:t>Alasan atau kebutuhan utama menggunakan AI</w:t>
             </w:r>
           </w:p>
         </w:tc>
@@ -10341,7 +10341,7 @@
                 <w:color w:val="0F172A"/>
                 <w:sz w:val="18"/>
               </w:rPr>
-              <w:t>Debugging, Copywriting, Ideation, Summarizing, Direct Answer</w:t>
+              <w:t>Debugging, Penulisan, Ideasi, Ringkasan, Jawaban Langsung</w:t>
             </w:r>
           </w:p>
         </w:tc>
@@ -10381,7 +10381,7 @@
                 <w:color w:val="0F172A"/>
                 <w:sz w:val="18"/>
               </w:rPr>
-              <w:t>Prompt_Engineering_Skill</w:t>
+              <w:t>Kemampuan Prompt Engineering</w:t>
             </w:r>
           </w:p>
         </w:tc>
@@ -10419,7 +10419,7 @@
                 <w:color w:val="0F172A"/>
                 <w:sz w:val="18"/>
               </w:rPr>
-              <w:t>Tingkat kemampuan rekayasa prompt</w:t>
+              <w:t>Tingkat keahlian merancang prompt</w:t>
             </w:r>
           </w:p>
         </w:tc>
@@ -10438,7 +10438,7 @@
                 <w:color w:val="0F172A"/>
                 <w:sz w:val="18"/>
               </w:rPr>
-              <w:t>Beginner, Intermediate, Advanced</w:t>
+              <w:t>Pemula, Menengah, Mahir</w:t>
             </w:r>
           </w:p>
         </w:tc>
@@ -10478,7 +10478,7 @@
                 <w:color w:val="0F172A"/>
                 <w:sz w:val="18"/>
               </w:rPr>
-              <w:t>Tool_Diversity</w:t>
+              <w:t>Keberagaman Alat AI</w:t>
             </w:r>
           </w:p>
         </w:tc>
@@ -10516,7 +10516,7 @@
                 <w:color w:val="0F172A"/>
                 <w:sz w:val="18"/>
               </w:rPr>
-              <w:t>Jumlah alat AI yang digunakan</w:t>
+              <w:t>Jumlah jenis alat AI yang digunakan</w:t>
             </w:r>
           </w:p>
         </w:tc>
@@ -10554,7 +10554,7 @@
                 <w:color w:val="0F172A"/>
                 <w:sz w:val="18"/>
               </w:rPr>
-              <w:t>Mean = 2.800</w:t>
+              <w:t>Rata-rata = 2,800</w:t>
             </w:r>
           </w:p>
         </w:tc>
@@ -10575,7 +10575,7 @@
                 <w:color w:val="0F172A"/>
                 <w:sz w:val="18"/>
               </w:rPr>
-              <w:t>Paid_Subscription</w:t>
+              <w:t>Status Akun Berbayar</w:t>
             </w:r>
           </w:p>
         </w:tc>
@@ -10613,7 +10613,7 @@
                 <w:color w:val="0F172A"/>
                 <w:sz w:val="18"/>
               </w:rPr>
-              <w:t>Status berlangganan berbayar</w:t>
+              <w:t>Status kepemilikan akun AI berbayar</w:t>
             </w:r>
           </w:p>
         </w:tc>
@@ -10632,7 +10632,7 @@
                 <w:color w:val="0F172A"/>
                 <w:sz w:val="18"/>
               </w:rPr>
-              <w:t>True / False</w:t>
+              <w:t>Ya / Tidak</w:t>
             </w:r>
           </w:p>
         </w:tc>
@@ -10672,7 +10672,7 @@
                 <w:color w:val="0F172A"/>
                 <w:sz w:val="18"/>
               </w:rPr>
-              <w:t>Traditional_Study_Hours</w:t>
+              <w:t>Jam Belajar Mandiri</w:t>
             </w:r>
           </w:p>
         </w:tc>
@@ -10710,7 +10710,7 @@
                 <w:color w:val="0F172A"/>
                 <w:sz w:val="18"/>
               </w:rPr>
-              <w:t>Jam belajar mandiri per minggu</w:t>
+              <w:t>Rata-rata jam belajar mandiri non-AI per minggu</w:t>
             </w:r>
           </w:p>
         </w:tc>
@@ -10729,7 +10729,7 @@
                 <w:color w:val="0F172A"/>
                 <w:sz w:val="18"/>
               </w:rPr>
-              <w:t>1.000 – 35.860</w:t>
+              <w:t>1,000 – 35,860</w:t>
             </w:r>
           </w:p>
         </w:tc>
@@ -10748,7 +10748,7 @@
                 <w:color w:val="0F172A"/>
                 <w:sz w:val="18"/>
               </w:rPr>
-              <w:t>Mean = 11.209</w:t>
+              <w:t>Rata-rata = 11,209</w:t>
             </w:r>
           </w:p>
         </w:tc>
@@ -10769,7 +10769,7 @@
                 <w:color w:val="0F172A"/>
                 <w:sz w:val="18"/>
               </w:rPr>
-              <w:t>Perceived_AI_Dependency</w:t>
+              <w:t>Persepsi Ketergantungan AI</w:t>
             </w:r>
           </w:p>
         </w:tc>
@@ -10807,7 +10807,7 @@
                 <w:color w:val="0F172A"/>
                 <w:sz w:val="18"/>
               </w:rPr>
-              <w:t>Skor persepsi ketergantungan AI (self-report)</w:t>
+              <w:t>Skor penilaian mandiri ketergantungan AI</w:t>
             </w:r>
           </w:p>
         </w:tc>
@@ -10845,7 +10845,7 @@
                 <w:color w:val="0F172A"/>
                 <w:sz w:val="18"/>
               </w:rPr>
-              <w:t>Mean = 3.505</w:t>
+              <w:t>Rata-rata = 3,505</w:t>
             </w:r>
           </w:p>
         </w:tc>
@@ -10866,7 +10866,7 @@
                 <w:color w:val="0F172A"/>
                 <w:sz w:val="18"/>
               </w:rPr>
-              <w:t>Institutional_Policy</w:t>
+              <w:t>Kebijakan Institusi</w:t>
             </w:r>
           </w:p>
         </w:tc>
@@ -10904,7 +10904,7 @@
                 <w:color w:val="0F172A"/>
                 <w:sz w:val="18"/>
               </w:rPr>
-              <w:t>Kebijakan institusi terhadap AI</w:t>
+              <w:t>Aturan kampus terkait penggunaan AI</w:t>
             </w:r>
           </w:p>
         </w:tc>
@@ -10923,7 +10923,7 @@
                 <w:color w:val="0F172A"/>
                 <w:sz w:val="18"/>
               </w:rPr>
-              <w:t>Actively_Encouraged, Allowed_With_Citation, Strict_Ban</w:t>
+              <w:t>Sangat Didorong, Diizinkan dengan Sitasi, Larangan Ketat</w:t>
             </w:r>
           </w:p>
         </w:tc>
@@ -10963,7 +10963,7 @@
                 <w:color w:val="0F172A"/>
                 <w:sz w:val="18"/>
               </w:rPr>
-              <w:t>Anxiety_Level_During_Exams</w:t>
+              <w:t>Tingkat Kecemasan Ujian</w:t>
             </w:r>
           </w:p>
         </w:tc>
@@ -11001,7 +11001,7 @@
                 <w:color w:val="0F172A"/>
                 <w:sz w:val="18"/>
               </w:rPr>
-              <w:t>Skor kecemasan saat ujian (self-report)</w:t>
+              <w:t>Skor penilaian mandiri kecemasan saat ujian</w:t>
             </w:r>
           </w:p>
         </w:tc>
@@ -11039,7 +11039,7 @@
                 <w:color w:val="0F172A"/>
                 <w:sz w:val="18"/>
               </w:rPr>
-              <w:t>Mean = 4.271</w:t>
+              <w:t>Rata-rata = 4,271</w:t>
             </w:r>
           </w:p>
         </w:tc>
@@ -11060,7 +11060,7 @@
                 <w:color w:val="0F172A"/>
                 <w:sz w:val="18"/>
               </w:rPr>
-              <w:t>Skill_Retention_Score</w:t>
+              <w:t>Skor Retensi Pengetahuan</w:t>
             </w:r>
           </w:p>
         </w:tc>
@@ -11098,7 +11098,7 @@
                 <w:color w:val="0F172A"/>
                 <w:sz w:val="18"/>
               </w:rPr>
-              <w:t>Skor retensi pengetahuan pasca-semester</w:t>
+              <w:t>Skor ujian pemahaman konsep pasca-semester</w:t>
             </w:r>
           </w:p>
         </w:tc>
@@ -11117,7 +11117,7 @@
                 <w:color w:val="0F172A"/>
                 <w:sz w:val="18"/>
               </w:rPr>
-              <w:t>10.780 – 100.000</w:t>
+              <w:t>10,780 – 100,000</w:t>
             </w:r>
           </w:p>
         </w:tc>
@@ -11136,7 +11136,7 @@
                 <w:color w:val="0F172A"/>
                 <w:sz w:val="18"/>
               </w:rPr>
-              <w:t>Mean = 75.798</w:t>
+              <w:t>Rata-rata = 75,798</w:t>
             </w:r>
           </w:p>
         </w:tc>
@@ -11157,7 +11157,7 @@
                 <w:color w:val="0F172A"/>
                 <w:sz w:val="18"/>
               </w:rPr>
-              <w:t>Burnout_Risk_Level</w:t>
+              <w:t>Tingkat Risiko Burnout</w:t>
             </w:r>
           </w:p>
         </w:tc>
@@ -11195,7 +11195,7 @@
                 <w:color w:val="0F172A"/>
                 <w:sz w:val="18"/>
               </w:rPr>
-              <w:t>Tingkat risiko burnout</w:t>
+              <w:t>Klasifikasi risiko burnout mahasiswa</w:t>
             </w:r>
           </w:p>
         </w:tc>
@@ -11214,7 +11214,7 @@
                 <w:color w:val="0F172A"/>
                 <w:sz w:val="18"/>
               </w:rPr>
-              <w:t>Low, Medium, High</w:t>
+              <w:t>Rendah, Sedang, Tinggi</w:t>
             </w:r>
           </w:p>
         </w:tc>
@@ -11233,7 +11233,7 @@
                 <w:color w:val="0F172A"/>
                 <w:sz w:val="18"/>
               </w:rPr>
-              <w:t>25,0% High</w:t>
+              <w:t>25,0% Tinggi</w:t>
             </w:r>
           </w:p>
         </w:tc>
@@ -11254,7 +11254,7 @@
                 <w:color w:val="0F172A"/>
                 <w:sz w:val="18"/>
               </w:rPr>
-              <w:t>AI_Usage_Segment</w:t>
+              <w:t>Segmen Penggunaan AI</w:t>
             </w:r>
           </w:p>
         </w:tc>
@@ -11311,7 +11311,7 @@
                 <w:color w:val="0F172A"/>
                 <w:sz w:val="18"/>
               </w:rPr>
-              <w:t>Light User, Moderate User, Heavy User</w:t>
+              <w:t>Pengguna Ringan, Sedang, Berat</w:t>
             </w:r>
           </w:p>
         </w:tc>
@@ -11330,7 +11330,7 @@
                 <w:color w:val="0F172A"/>
                 <w:sz w:val="18"/>
               </w:rPr>
-              <w:t>Dibuat dari Weekly_GenAI_Hours</w:t>
+              <w:t>Ditentukan dari jam mingguan</w:t>
             </w:r>
           </w:p>
         </w:tc>
@@ -11568,7 +11568,7 @@
                 <w:color w:val="0F172A"/>
                 <w:sz w:val="18"/>
               </w:rPr>
-              <w:t>Pre_Semester_GPA</w:t>
+              <w:t>IPK Awal</w:t>
             </w:r>
           </w:p>
         </w:tc>
@@ -11722,7 +11722,7 @@
                 <w:color w:val="0F172A"/>
                 <w:sz w:val="18"/>
               </w:rPr>
-              <w:t>Post_Semester_GPA</w:t>
+              <w:t>IPK Akhir</w:t>
             </w:r>
           </w:p>
         </w:tc>
@@ -11876,7 +11876,7 @@
                 <w:color w:val="0F172A"/>
                 <w:sz w:val="18"/>
               </w:rPr>
-              <w:t>Delta_IPK</w:t>
+              <w:t>Perubahan IPK</w:t>
             </w:r>
           </w:p>
         </w:tc>
@@ -12030,7 +12030,7 @@
                 <w:color w:val="0F172A"/>
                 <w:sz w:val="18"/>
               </w:rPr>
-              <w:t>Weekly_GenAI_Hours</w:t>
+              <w:t>Jam Penggunaan AI Mingguan</w:t>
             </w:r>
           </w:p>
         </w:tc>
@@ -12184,7 +12184,7 @@
                 <w:color w:val="0F172A"/>
                 <w:sz w:val="18"/>
               </w:rPr>
-              <w:t>Traditional_Study_Hours</w:t>
+              <w:t>Jam Belajar Mandiri</w:t>
             </w:r>
           </w:p>
         </w:tc>
@@ -12338,7 +12338,7 @@
                 <w:color w:val="0F172A"/>
                 <w:sz w:val="18"/>
               </w:rPr>
-              <w:t>Perceived_AI_Dependency</w:t>
+              <w:t>Persepsi Ketergantungan AI</w:t>
             </w:r>
           </w:p>
         </w:tc>
@@ -12492,7 +12492,7 @@
                 <w:color w:val="0F172A"/>
                 <w:sz w:val="18"/>
               </w:rPr>
-              <w:t>Tool_Diversity</w:t>
+              <w:t>Keberagaman Alat AI</w:t>
             </w:r>
           </w:p>
         </w:tc>
@@ -12646,7 +12646,7 @@
                 <w:color w:val="0F172A"/>
                 <w:sz w:val="18"/>
               </w:rPr>
-              <w:t>Anxiety_Level_During_Exams</w:t>
+              <w:t>Tingkat Kecemasan Ujian</w:t>
             </w:r>
           </w:p>
         </w:tc>
@@ -12800,7 +12800,7 @@
                 <w:color w:val="0F172A"/>
                 <w:sz w:val="18"/>
               </w:rPr>
-              <w:t>Skill_Retention_Score</w:t>
+              <w:t>Skor Retensi Pengetahuan</w:t>
             </w:r>
           </w:p>
         </w:tc>
@@ -13025,7 +13025,7 @@
                 <w:color w:val="FFFFFF"/>
                 <w:sz w:val="18"/>
               </w:rPr>
-              <w:t>Student_ID Terdampak</w:t>
+              <w:t>ID Mahasiswa Terdampak</w:t>
             </w:r>
           </w:p>
         </w:tc>
@@ -13145,7 +13145,7 @@
                 <w:color w:val="0F172A"/>
                 <w:sz w:val="18"/>
               </w:rPr>
-              <w:t>Imputasi Primary_Use_Case</w:t>
+              <w:t>Imputasi Tujuan Penggunaan AI</w:t>
             </w:r>
           </w:p>
         </w:tc>
@@ -13223,7 +13223,7 @@
                 <w:color w:val="0F172A"/>
                 <w:sz w:val="18"/>
               </w:rPr>
-              <w:t>Hapus baris: Post_Semester_GPA kosong</w:t>
+              <w:t>Hapus baris: IPK Akhir kosong</w:t>
             </w:r>
           </w:p>
         </w:tc>
@@ -13301,7 +13301,7 @@
                 <w:color w:val="0F172A"/>
                 <w:sz w:val="18"/>
               </w:rPr>
-              <w:t>Hapus baris: Pre_Semester_GPA &gt; 4.00</w:t>
+              <w:t>Hapus baris: IPK Awal &gt; 4.00</w:t>
             </w:r>
           </w:p>
         </w:tc>
@@ -13379,7 +13379,7 @@
                 <w:color w:val="0F172A"/>
                 <w:sz w:val="18"/>
               </w:rPr>
-              <w:t>Hapus baris: Post_Semester_GPA &gt; 4.00</w:t>
+              <w:t>Hapus baris: IPK Akhir &gt; 4.00</w:t>
             </w:r>
           </w:p>
         </w:tc>
@@ -13457,7 +13457,7 @@
                 <w:color w:val="0F172A"/>
                 <w:sz w:val="18"/>
               </w:rPr>
-              <w:t>Hapus baris: Tool_Diversity &gt; 5</w:t>
+              <w:t>Hapus baris: Keberagaman Alat AI &gt; 5</w:t>
             </w:r>
           </w:p>
         </w:tc>
@@ -13535,7 +13535,7 @@
                 <w:color w:val="0F172A"/>
                 <w:sz w:val="18"/>
               </w:rPr>
-              <w:t>Hapus baris: Year_of_Study = "123"</w:t>
+              <w:t>Hapus baris: Tahun Studi = "123"</w:t>
             </w:r>
           </w:p>
         </w:tc>
@@ -13670,7 +13670,7 @@
                 <w:color w:val="0F172A"/>
                 <w:sz w:val="18"/>
               </w:rPr>
-              <w:t>Student_ID → Int64; Paid_Subscription → Boolean</w:t>
+              <w:t>ID Mahasiswa → Integer 64-bit; Langganan Berbayar → Boolean</w:t>
             </w:r>
           </w:p>
         </w:tc>
@@ -13800,7 +13800,7 @@
                 <w:color w:val="0F172A"/>
                 <w:sz w:val="18"/>
               </w:rPr>
-              <w:t>Library Analisis</w:t>
+              <w:t>Pustaka Analisis Data</w:t>
             </w:r>
           </w:p>
         </w:tc>
@@ -13840,7 +13840,7 @@
                 <w:color w:val="0F172A"/>
                 <w:sz w:val="18"/>
               </w:rPr>
-              <w:t>Library Visualisasi</w:t>
+              <w:t>Pustaka Visualisasi</w:t>
             </w:r>
           </w:p>
         </w:tc>
@@ -13880,7 +13880,7 @@
                 <w:color w:val="0F172A"/>
                 <w:sz w:val="18"/>
               </w:rPr>
-              <w:t>Framework Dashboard</w:t>
+              <w:t>Kerangka Kerja Dashboard</w:t>
             </w:r>
           </w:p>
         </w:tc>
@@ -13899,7 +13899,7 @@
                 <w:color w:val="0F172A"/>
                 <w:sz w:val="18"/>
               </w:rPr>
-              <w:t>Streamlit (multi-halaman: Overview &amp; Segmentasi)</w:t>
+              <w:t>Streamlit (multi-halaman: Ringkasan &amp; Segmentasi)</w:t>
             </w:r>
           </w:p>
         </w:tc>

</xml_diff>